<commit_message>
Render pull_request 72dae7396296631d8204a071655d70c0892c5a51 Migrate from Manubot to Quartobot 72dae7396296631d8204a071655d70c0892c5a51
</commit_message>
<xml_diff>
--- a/pr/6/manuscript.docx
+++ b/pr/6/manuscript.docx
@@ -230,107 +230,314 @@
         <w:t xml:space="preserve">web analytics data across the portfolio.</w:t>
       </w:r>
     </w:p>
-    <w:bookmarkStart w:id="9" w:name="bigger-picture"/>
+    <w:tbl>
+      <w:tblPr>
+        <w:tblStyle w:val="Table"/>
+        <w:tblInd w:w="164" w:type="dxa"/>
+        <w:tblBorders>
+          <w:left w:val="single" w:sz="24" w:space="0" w:color="0758E5"/>
+        </w:tblBorders>
+        <w:tblCellMar>
+          <w:left w:w="0" w:type="dxa"/>
+          <w:right w:w="0" w:type="dxa"/>
+        </w:tblCellMar>
+        <w:tblLook w:firstRow="0" w:lastRow="0" w:firstColumn="0" w:lastColumn="0" w:noHBand="0" w:noVBand="0" w:val="0000"/>
+      </w:tblPr>
+      <w:tblGrid>
+        <w:gridCol w:w="7920"/>
+      </w:tblGrid>
+      <w:tr>
+        <w:trPr>
+          <w:cantSplit/>
+        </w:trPr>
+        <w:tc>
+          <w:tcPr>
+            <w:tcMar>
+              <w:left w:w="144" w:type="dxa"/>
+              <w:right w:w="144" w:type="dxa"/>
+            </w:tcMar>
+          </w:tcPr>
+          <w:p>
+            <w:pPr>
+              <w:pStyle w:val="FirstParagraph"/>
+            </w:pPr>
+            <w:pPr>
+              <w:spacing w:before="0" w:after="8"/>
+              <w:jc w:val="center"/>
+            </w:pPr>
+            <w:r>
+              <w:drawing>
+                <wp:inline>
+                  <wp:extent cx="152400" cy="152400"/>
+                  <wp:effectExtent b="0" l="0" r="0" t="0"/>
+                  <wp:docPr descr="" title="" id="10" name="Picture"/>
+                  <a:graphic>
+                    <a:graphicData uri="http://schemas.openxmlformats.org/drawingml/2006/picture">
+                      <pic:pic>
+                        <pic:nvPicPr>
+                          <pic:cNvPr descr="/opt/quarto/share/formats/docx/note.png" id="11" name="Picture"/>
+                          <pic:cNvPicPr>
+                            <a:picLocks noChangeArrowheads="1" noChangeAspect="1"/>
+                          </pic:cNvPicPr>
+                        </pic:nvPicPr>
+                        <pic:blipFill>
+                          <a:blip r:embed="rId9"/>
+                          <a:stretch>
+                            <a:fillRect/>
+                          </a:stretch>
+                        </pic:blipFill>
+                        <pic:spPr bwMode="auto">
+                          <a:xfrm>
+                            <a:off x="0" y="0"/>
+                            <a:ext cx="152400" cy="152400"/>
+                          </a:xfrm>
+                          <a:prstGeom prst="rect">
+                            <a:avLst/>
+                          </a:prstGeom>
+                          <a:noFill/>
+                          <a:ln w="9525">
+                            <a:noFill/>
+                            <a:headEnd/>
+                            <a:tailEnd/>
+                          </a:ln>
+                        </pic:spPr>
+                      </pic:pic>
+                    </a:graphicData>
+                  </a:graphic>
+                </wp:inline>
+              </w:drawing>
+            </w:r>
+          </w:p>
+        </w:tc>
+        <w:tc>
+          <w:p>
+            <w:pPr>
+              <w:pStyle w:val="BodyText"/>
+            </w:pPr>
+            <w:pPr>
+              <w:spacing w:before="16" w:after="64"/>
+            </w:pPr>
+            <w:r>
+              <w:rPr>
+                <w:b/>
+                <w:bCs/>
+              </w:rPr>
+              <w:t xml:space="preserve">Highlights</w:t>
+            </w:r>
+          </w:p>
+          <w:p>
+            <w:pPr>
+              <w:pStyle w:val="Compact"/>
+              <w:numPr>
+                <w:ilvl w:val="0"/>
+                <w:numId w:val="1001"/>
+              </w:numPr>
+            </w:pPr>
+            <w:r>
+              <w:t xml:space="preserve">NIH’s federated biomedical data ecosystems track different metrics in different ways, which blocks portfolio-level comparison and evidence-driven funding decisions.</w:t>
+            </w:r>
+          </w:p>
+          <w:p>
+            <w:pPr>
+              <w:pStyle w:val="Compact"/>
+              <w:numPr>
+                <w:ilvl w:val="0"/>
+                <w:numId w:val="1001"/>
+              </w:numPr>
+            </w:pPr>
+            <w:r>
+              <w:t xml:space="preserve">Three prioritization frameworks long familiar in product strategy (public value, scientific quality, operations and finance) carry over cleanly to research data resources.</w:t>
+            </w:r>
+          </w:p>
+          <w:p>
+            <w:pPr>
+              <w:pStyle w:val="Compact"/>
+              <w:numPr>
+                <w:ilvl w:val="0"/>
+                <w:numId w:val="1001"/>
+              </w:numPr>
+            </w:pPr>
+            <w:r>
+              <w:t xml:space="preserve">Which framework dominates depends on the resource’s lifecycle phase; uniform metric panels across phases misallocate funding.</w:t>
+            </w:r>
+          </w:p>
+          <w:p>
+            <w:pPr>
+              <w:pStyle w:val="Compact"/>
+              <w:numPr>
+                <w:ilvl w:val="0"/>
+                <w:numId w:val="1001"/>
+              </w:numPr>
+            </w:pPr>
+            <w:r>
+              <w:t xml:space="preserve">Fewer than 30% of secondary analyses formally cite their source data, so raw citation counts systematically understate reuse.</w:t>
+            </w:r>
+          </w:p>
+          <w:p>
+            <w:pPr>
+              <w:pStyle w:val="Compact"/>
+              <w:numPr>
+                <w:ilvl w:val="0"/>
+                <w:numId w:val="1001"/>
+              </w:numPr>
+            </w:pPr>
+            <w:r>
+              <w:t xml:space="preserve">A portfolio-wide dashboard at the NIH Common Fund Data Ecosystem now operationalizes the model across 19 programs in near real time.</w:t>
+            </w:r>
+          </w:p>
+        </w:tc>
+      </w:tr>
+    </w:tbl>
+    <w:p>
+      <w:pPr>
+        <w:pStyle w:val="FirstParagraph"/>
+      </w:pPr>
+      <w:r>
+        <w:t xml:space="preserve"> </w:t>
+      </w:r>
+    </w:p>
+    <w:tbl>
+      <w:tblPr>
+        <w:tblStyle w:val="Table"/>
+        <w:tblLook w:firstRow="0" w:lastRow="0" w:firstColumn="0" w:lastColumn="0" w:noHBand="0" w:noVBand="0" w:val="0000"/>
+        <w:tblBorders>
+          <w:top w:val="single" w:sz="4" w:space="0" w:color="0758E5"/>
+          <w:left w:val="single" w:sz="24" w:space="0" w:color="0758E5"/>
+          <w:bottom w:val="single" w:sz="4" w:space="0" w:color="0758E5"/>
+          <w:right w:val="single" w:sz="4" w:space="0" w:color="0758E5"/>
+        </w:tblBorders>
+        <w:tblCellMar>
+          <w:left w:w="144" w:type="dxa"/>
+          <w:right w:w="144" w:type="dxa"/>
+        </w:tblCellMar>
+        <w:tblLook w:firstRow="0" w:lastRow="0" w:firstColumn="0" w:lastColumn="0" w:noHBand="0" w:noVBand="0" w:val="0000"/>
+      </w:tblPr>
+      <w:tr>
+        <w:trPr>
+          <w:cantSplit/>
+        </w:trPr>
+        <w:tc>
+          <w:tcPr>
+            <w:shd w:color="auto" w:fill="dae6fb" w:val="clear"/>
+            <w:tcMar>
+              <w:top w:w="92" w:type="dxa"/>
+              <w:bottom w:w="92" w:type="dxa"/>
+            </w:tcMar>
+          </w:tcPr>
+          <w:p>
+            <w:pPr>
+              <w:pStyle w:val="BodyText"/>
+            </w:pPr>
+            <w:pPr>
+              <w:spacing w:before="0" w:after="0"/>
+              <w:textAlignment w:val="center"/>
+            </w:pPr>
+            <w:r>
+              <w:drawing>
+                <wp:inline>
+                  <wp:extent cx="152400" cy="152400"/>
+                  <wp:effectExtent b="0" l="0" r="0" t="0"/>
+                  <wp:docPr descr="" title="" id="12" name="Picture"/>
+                  <a:graphic>
+                    <a:graphicData uri="http://schemas.openxmlformats.org/drawingml/2006/picture">
+                      <pic:pic>
+                        <pic:nvPicPr>
+                          <pic:cNvPr descr="/opt/quarto/share/formats/docx/note.png" id="13" name="Picture"/>
+                          <pic:cNvPicPr>
+                            <a:picLocks noChangeArrowheads="1" noChangeAspect="1"/>
+                          </pic:cNvPicPr>
+                        </pic:nvPicPr>
+                        <pic:blipFill>
+                          <a:blip r:embed="rId9"/>
+                          <a:stretch>
+                            <a:fillRect/>
+                          </a:stretch>
+                        </pic:blipFill>
+                        <pic:spPr bwMode="auto">
+                          <a:xfrm>
+                            <a:off x="0" y="0"/>
+                            <a:ext cx="152400" cy="152400"/>
+                          </a:xfrm>
+                          <a:prstGeom prst="rect">
+                            <a:avLst/>
+                          </a:prstGeom>
+                          <a:noFill/>
+                          <a:ln w="9525">
+                            <a:noFill/>
+                            <a:headEnd/>
+                            <a:tailEnd/>
+                          </a:ln>
+                        </pic:spPr>
+                      </pic:pic>
+                    </a:graphicData>
+                  </a:graphic>
+                </wp:inline>
+              </w:drawing>
+            </w:r>
+            <w:r>
+              <w:t xml:space="preserve"> </w:t>
+            </w:r>
+            <w:r>
+              <w:t xml:space="preserve"> </w:t>
+            </w:r>
+            <w:r>
+              <w:t xml:space="preserve">Significance</w:t>
+            </w:r>
+          </w:p>
+        </w:tc>
+      </w:tr>
+      <w:tr>
+        <w:trPr>
+          <w:cantSplit/>
+        </w:trPr>
+        <w:tc>
+          <w:tcPr>
+            <w:tcMar>
+              <w:top w:w="108" w:type="dxa"/>
+              <w:bottom w:w="108" w:type="dxa"/>
+            </w:tcMar>
+          </w:tcPr>
+          <w:p>
+            <w:pPr>
+              <w:pStyle w:val="BodyText"/>
+            </w:pPr>
+            <w:pPr>
+              <w:spacing w:before="16"/>
+            </w:pPr>
+            <w:r>
+              <w:t xml:space="preserve">Public data ecosystems are central infrastructure across biology, medicine, and the data sciences, but whether any given resource is succeeding mostly goes unanswered. Each funded program tracks its own metrics in its own way, which makes portfolio-level comparison effectively impossible.</w:t>
+            </w:r>
+          </w:p>
+          <w:p>
+            <w:pPr>
+              <w:pStyle w:val="BodyText"/>
+            </w:pPr>
+            <w:r>
+              <w:t xml:space="preserve">Three prioritization frameworks long familiar in product strategy (public value, scientific quality, operations and finance) carry over cleanly to research data resources. Their relative weight shifts predictably across a resource’s lifecycle. Uniform metric panels ignore that shift and misallocate funding as a result.</w:t>
+            </w:r>
+          </w:p>
+          <w:p>
+            <w:pPr>
+              <w:pStyle w:val="BodyText"/>
+            </w:pPr>
+            <w:pPr>
+              <w:spacing w:after="16"/>
+            </w:pPr>
+            <w:r>
+              <w:t xml:space="preserve">We ground the argument in the NIH Common Fund Data Ecosystem, where a portfolio-wide dashboard now operationalizes the model across 19 programs. The framework generalizes to every federated biomedical data ecosystem and gives evaluators a shared vocabulary, instead of forcing each program to invent its own.</w:t>
+            </w:r>
+          </w:p>
+          <w:p/>
+        </w:tc>
+      </w:tr>
+    </w:tbl>
+    <w:bookmarkStart w:id="24" w:name="main-text"/>
     <w:p>
       <w:pPr>
         <w:pStyle w:val="Heading2"/>
       </w:pPr>
       <w:r>
-        <w:t xml:space="preserve">0.1 Bigger Picture</w:t>
-      </w:r>
-    </w:p>
-    <w:p>
-      <w:pPr>
-        <w:pStyle w:val="FirstParagraph"/>
-      </w:pPr>
-      <w:r>
-        <w:t xml:space="preserve">The U.S. government spends hundreds of millions of dollars every year creating and maintaining large collections of biomedical research data — from genome sequences of hundreds of thousands of people to detailed maps of every cell type in the human body.</w:t>
-      </w:r>
-      <w:r>
-        <w:t xml:space="preserve"> </w:t>
-      </w:r>
-      <w:r>
-        <w:t xml:space="preserve">The goal is to make these datasets openly available to scientists everywhere, accelerating discoveries that no single laboratory could achieve alone.</w:t>
-      </w:r>
-    </w:p>
-    <w:p>
-      <w:pPr>
-        <w:pStyle w:val="BodyText"/>
-      </w:pPr>
-      <w:r>
-        <w:t xml:space="preserve">But how do we know whether this investment is paying off?</w:t>
-      </w:r>
-      <w:r>
-        <w:t xml:space="preserve"> </w:t>
-      </w:r>
-      <w:r>
-        <w:t xml:space="preserve">At present, each funded program tracks its own success metrics — if it tracks them at all — making it nearly impossible to compare programs or to learn from what works.</w:t>
-      </w:r>
-      <w:r>
-        <w:t xml:space="preserve"> </w:t>
-      </w:r>
-      <w:r>
-        <w:t xml:space="preserve">This is a significant missed opportunity.</w:t>
-      </w:r>
-      <w:r>
-        <w:t xml:space="preserve"> </w:t>
-      </w:r>
-      <w:r>
-        <w:t xml:space="preserve">In the business world, organizations use structured</w:t>
-      </w:r>
-      <w:r>
-        <w:t xml:space="preserve"> </w:t>
-      </w:r>
-      <w:r>
-        <w:t xml:space="preserve">“performance frameworks”</w:t>
-      </w:r>
-      <w:r>
-        <w:t xml:space="preserve"> </w:t>
-      </w:r>
-      <w:r>
-        <w:t xml:space="preserve">to evaluate products, adjust strategies, and decide where to invest next.</w:t>
-      </w:r>
-      <w:r>
-        <w:t xml:space="preserve"> </w:t>
-      </w:r>
-      <w:r>
-        <w:t xml:space="preserve">Publicly funded science deserves the same discipline.</w:t>
-      </w:r>
-    </w:p>
-    <w:p>
-      <w:pPr>
-        <w:pStyle w:val="BodyText"/>
-      </w:pPr>
-      <w:r>
-        <w:t xml:space="preserve">In this paper, we describe three frameworks for evaluating biomedical data resources: one focused on how widely the data are used and scientifically cited, one on whether the data are well-documented and reusable by others, and one on whether the underlying infrastructure is reliable and financially sustainable.</w:t>
-      </w:r>
-      <w:r>
-        <w:t xml:space="preserve"> </w:t>
-      </w:r>
-      <w:r>
-        <w:t xml:space="preserve">We argue that different metrics matter more at different stages of a project’s life — early on, data quality and infrastructure are paramount; later, scientific impact and long-term cost become critical.</w:t>
-      </w:r>
-      <w:r>
-        <w:t xml:space="preserve"> </w:t>
-      </w:r>
-      <w:r>
-        <w:t xml:space="preserve">We also report on the NIH Common Fund Data Ecosystem’s first steps toward putting these ideas into practice — a centralized dashboard that automatically collects and visualizes metrics across 19 programs, giving program managers a portfolio-wide view for the first time.</w:t>
-      </w:r>
-      <w:r>
-        <w:t xml:space="preserve"> </w:t>
-      </w:r>
-      <w:r>
-        <w:t xml:space="preserve">Standardizing a common evaluation language across all NIH data programs would enable better decisions about where to invest, how to sustain valuable resources, and when to gracefully retire those that have served their purpose.</w:t>
-      </w:r>
-    </w:p>
-    <w:bookmarkEnd w:id="9"/>
-    <w:bookmarkStart w:id="20" w:name="main-text"/>
-    <w:p>
-      <w:pPr>
-        <w:pStyle w:val="Heading2"/>
-      </w:pPr>
-      <w:r>
-        <w:t xml:space="preserve">0.2 Main text</w:t>
+        <w:t xml:space="preserve">0.1 Main text</w:t>
       </w:r>
     </w:p>
     <w:p>
@@ -612,7 +819,7 @@
       <w:tr>
         <w:tc>
           <w:tcPr/>
-          <w:bookmarkStart w:id="10" w:name="tbl-center-eval"/>
+          <w:bookmarkStart w:id="14" w:name="tbl-center-eval"/>
           <w:p>
             <w:pPr>
               <w:jc w:val="center"/>
@@ -809,7 +1016,7 @@
               </w:tc>
             </w:tr>
           </w:tbl>
-          <w:bookmarkEnd w:id="10"/>
+          <w:bookmarkEnd w:id="14"/>
           <w:p/>
         </w:tc>
       </w:tr>
@@ -997,13 +1204,13 @@
         <w:t xml:space="preserve">Furthermore, we describe the ICC’s implementation of an automated dashboard that reduces the burden on individual projects while enabling real-time monitoring of portfolio performance.</w:t>
       </w:r>
     </w:p>
-    <w:bookmarkStart w:id="15" w:name="three-frameworks-one-lifecycle"/>
+    <w:bookmarkStart w:id="19" w:name="three-frameworks-one-lifecycle"/>
     <w:p>
       <w:pPr>
         <w:pStyle w:val="Heading3"/>
       </w:pPr>
       <w:r>
-        <w:t xml:space="preserve">0.2.1 Three Frameworks, One Lifecycle</w:t>
+        <w:t xml:space="preserve">0.1.1 Three Frameworks, One Lifecycle</w:t>
       </w:r>
     </w:p>
     <w:p>
@@ -1255,7 +1462,7 @@
       <w:tr>
         <w:tc>
           <w:tcPr/>
-          <w:bookmarkStart w:id="14" w:name="fig-lifecycle_curves"/>
+          <w:bookmarkStart w:id="18" w:name="fig-lifecycle_curves"/>
           <w:p>
             <w:pPr>
               <w:pStyle w:val="Compact"/>
@@ -1266,18 +1473,18 @@
                 <wp:inline>
                   <wp:extent cx="5334000" cy="3403035"/>
                   <wp:effectExtent b="0" l="0" r="0" t="0"/>
-                  <wp:docPr descr="" title="" id="12" name="Picture"/>
+                  <wp:docPr descr="" title="" id="16" name="Picture"/>
                   <a:graphic>
                     <a:graphicData uri="http://schemas.openxmlformats.org/drawingml/2006/picture">
                       <pic:pic>
                         <pic:nvPicPr>
-                          <pic:cNvPr descr="content/images/figure1_lifecycle_curves.png" id="13" name="Picture"/>
+                          <pic:cNvPr descr="content/images/figure1_lifecycle_curves.png" id="17" name="Picture"/>
                           <pic:cNvPicPr>
                             <a:picLocks noChangeArrowheads="1" noChangeAspect="1"/>
                           </pic:cNvPicPr>
                         </pic:nvPicPr>
                         <pic:blipFill>
-                          <a:blip r:embed="rId11"/>
+                          <a:blip r:embed="rId15"/>
                           <a:stretch>
                             <a:fillRect/>
                           </a:stretch>
@@ -1333,7 +1540,7 @@
               <w:t xml:space="preserve">imply unimportant.</w:t>
             </w:r>
           </w:p>
-          <w:bookmarkEnd w:id="14"/>
+          <w:bookmarkEnd w:id="18"/>
         </w:tc>
       </w:tr>
     </w:tbl>
@@ -1423,14 +1630,14 @@
         <w:t xml:space="preserve">For each framework, we describe key metrics, their strengths and limitations, and highlight what current measurement approaches are missing.</w:t>
       </w:r>
     </w:p>
-    <w:bookmarkEnd w:id="15"/>
-    <w:bookmarkStart w:id="16" w:name="public-value"/>
+    <w:bookmarkEnd w:id="19"/>
+    <w:bookmarkStart w:id="20" w:name="public-value"/>
     <w:p>
       <w:pPr>
         <w:pStyle w:val="Heading3"/>
       </w:pPr>
       <w:r>
-        <w:t xml:space="preserve">0.2.2 Public value</w:t>
+        <w:t xml:space="preserve">0.1.2 Public value</w:t>
       </w:r>
     </w:p>
     <w:p>
@@ -2267,14 +2474,14 @@
         <w:t xml:space="preserve">These indicators capture whether a data ecosystem is achieving its ultimate goal of democratizing access and accelerating discovery.</w:t>
       </w:r>
     </w:p>
-    <w:bookmarkEnd w:id="16"/>
-    <w:bookmarkStart w:id="17" w:name="scientific-quality"/>
+    <w:bookmarkEnd w:id="20"/>
+    <w:bookmarkStart w:id="21" w:name="scientific-quality"/>
     <w:p>
       <w:pPr>
         <w:pStyle w:val="Heading3"/>
       </w:pPr>
       <w:r>
-        <w:t xml:space="preserve">0.2.3 Scientific quality</w:t>
+        <w:t xml:space="preserve">0.1.3 Scientific quality</w:t>
       </w:r>
     </w:p>
     <w:p>
@@ -2751,14 +2958,14 @@
         <w:t xml:space="preserve">.</w:t>
       </w:r>
     </w:p>
-    <w:bookmarkEnd w:id="17"/>
-    <w:bookmarkStart w:id="19" w:name="operations-and-finance"/>
+    <w:bookmarkEnd w:id="21"/>
+    <w:bookmarkStart w:id="23" w:name="operations-and-finance"/>
     <w:p>
       <w:pPr>
         <w:pStyle w:val="Heading3"/>
       </w:pPr>
       <w:r>
-        <w:t xml:space="preserve">0.2.4 Operations and finance</w:t>
+        <w:t xml:space="preserve">0.1.4 Operations and finance</w:t>
       </w:r>
     </w:p>
     <w:p>
@@ -3242,7 +3449,7 @@
       <w:tr>
         <w:tc>
           <w:tcPr/>
-          <w:bookmarkStart w:id="18" w:name="tbl-metrics-summary"/>
+          <w:bookmarkStart w:id="22" w:name="tbl-metrics-summary"/>
           <w:p>
             <w:pPr>
               <w:jc w:val="center"/>
@@ -8068,20 +8275,20 @@
               </w:tc>
             </w:tr>
           </w:tbl>
-          <w:bookmarkEnd w:id="18"/>
+          <w:bookmarkEnd w:id="22"/>
           <w:p/>
         </w:tc>
       </w:tr>
     </w:tbl>
-    <w:bookmarkEnd w:id="19"/>
-    <w:bookmarkEnd w:id="20"/>
-    <w:bookmarkStart w:id="26" w:name="implementation-progress"/>
+    <w:bookmarkEnd w:id="23"/>
+    <w:bookmarkEnd w:id="24"/>
+    <w:bookmarkStart w:id="30" w:name="implementation-progress"/>
     <w:p>
       <w:pPr>
         <w:pStyle w:val="Heading2"/>
       </w:pPr>
       <w:r>
-        <w:t xml:space="preserve">0.3 Implementation Progress</w:t>
+        <w:t xml:space="preserve">0.2 Implementation Progress</w:t>
       </w:r>
     </w:p>
     <w:p>
@@ -8137,7 +8344,7 @@
       <w:tr>
         <w:tc>
           <w:tcPr/>
-          <w:bookmarkStart w:id="21" w:name="tbl-metrics-cfde"/>
+          <w:bookmarkStart w:id="25" w:name="tbl-metrics-cfde"/>
           <w:p>
             <w:pPr>
               <w:jc w:val="center"/>
@@ -8480,7 +8687,7 @@
               </w:tc>
             </w:tr>
           </w:tbl>
-          <w:bookmarkEnd w:id="21"/>
+          <w:bookmarkEnd w:id="25"/>
           <w:p/>
         </w:tc>
       </w:tr>
@@ -8598,7 +8805,7 @@
       <w:tr>
         <w:tc>
           <w:tcPr/>
-          <w:bookmarkStart w:id="25" w:name="fig-dashboard"/>
+          <w:bookmarkStart w:id="29" w:name="fig-dashboard"/>
           <w:p>
             <w:pPr>
               <w:pStyle w:val="Compact"/>
@@ -8609,18 +8816,18 @@
                 <wp:inline>
                   <wp:extent cx="5334000" cy="2147548"/>
                   <wp:effectExtent b="0" l="0" r="0" t="0"/>
-                  <wp:docPr descr="" title="" id="23" name="Picture"/>
+                  <wp:docPr descr="" title="" id="27" name="Picture"/>
                   <a:graphic>
                     <a:graphicData uri="http://schemas.openxmlformats.org/drawingml/2006/picture">
                       <pic:pic>
                         <pic:nvPicPr>
-                          <pic:cNvPr descr="content/images/dashboard_screenshot.png" id="24" name="Picture"/>
+                          <pic:cNvPr descr="content/images/dashboard_screenshot.png" id="28" name="Picture"/>
                           <pic:cNvPicPr>
                             <a:picLocks noChangeArrowheads="1" noChangeAspect="1"/>
                           </pic:cNvPicPr>
                         </pic:nvPicPr>
                         <pic:blipFill>
-                          <a:blip r:embed="rId22"/>
+                          <a:blip r:embed="rId26"/>
                           <a:stretch>
                             <a:fillRect/>
                           </a:stretch>
@@ -8660,7 +8867,7 @@
               <w:t xml:space="preserve">Figure 2: Screenshot of the CFDE ICC dashboard showing project-level and portfolio-level metrics. The dashboard is expected evolve over time. Authentication and authorization controls are implemented in accordance with CFDE community consensus on data access (private vs public).</w:t>
             </w:r>
           </w:p>
-          <w:bookmarkEnd w:id="25"/>
+          <w:bookmarkEnd w:id="29"/>
         </w:tc>
       </w:tr>
     </w:tbl>
@@ -8765,14 +8972,14 @@
         <w:t xml:space="preserve">.</w:t>
       </w:r>
     </w:p>
-    <w:bookmarkEnd w:id="26"/>
-    <w:bookmarkStart w:id="27" w:name="conclusion"/>
+    <w:bookmarkEnd w:id="30"/>
+    <w:bookmarkStart w:id="31" w:name="conclusion"/>
     <w:p>
       <w:pPr>
         <w:pStyle w:val="Heading2"/>
       </w:pPr>
       <w:r>
-        <w:t xml:space="preserve">0.4 Conclusion</w:t>
+        <w:t xml:space="preserve">0.3 Conclusion</w:t>
       </w:r>
     </w:p>
     <w:p>
@@ -9227,14 +9434,14 @@
         <w:t xml:space="preserve">The ICC’s dashboard and metric collection infrastructure demonstrate that such standardization is achievable, and the frameworks presented here, grounded in real evaluation data from the CFDE, offer a blueprint for extending this approach to the broader NIH data ecosystem.</w:t>
       </w:r>
     </w:p>
-    <w:bookmarkEnd w:id="27"/>
-    <w:bookmarkStart w:id="28" w:name="acknowledgments"/>
+    <w:bookmarkEnd w:id="31"/>
+    <w:bookmarkStart w:id="32" w:name="acknowledgments"/>
     <w:p>
       <w:pPr>
         <w:pStyle w:val="Heading2"/>
       </w:pPr>
       <w:r>
-        <w:t xml:space="preserve">0.5 Acknowledgments</w:t>
+        <w:t xml:space="preserve">0.4 Acknowledgments</w:t>
       </w:r>
     </w:p>
     <w:p>
@@ -9257,14 +9464,14 @@
         <w:t xml:space="preserve">We also thank the CFDE project teams for their collaboration in sharing data and providing feedback on the dashboard and metrics collection processes.</w:t>
       </w:r>
     </w:p>
-    <w:bookmarkEnd w:id="28"/>
-    <w:bookmarkStart w:id="29" w:name="author-contributions"/>
+    <w:bookmarkEnd w:id="32"/>
+    <w:bookmarkStart w:id="33" w:name="author-contributions"/>
     <w:p>
       <w:pPr>
         <w:pStyle w:val="Heading2"/>
       </w:pPr>
       <w:r>
-        <w:t xml:space="preserve">0.6 Author contributions</w:t>
+        <w:t xml:space="preserve">0.5 Author contributions</w:t>
       </w:r>
     </w:p>
     <w:p>
@@ -9281,14 +9488,14 @@
         <w:t xml:space="preserve">Ethan M. Lange, Vikram Adithya Ganesh, Faisal Alquaddoomi, David Mayer, Adriana Ivich, Vince Rubinetti, Casey Greene, and Sean Davis each made substantial contributions to the conception or design of the work and to the acquisition, analysis, or interpretation of data; participated in drafting the manuscript or revising it critically for important intellectual content; approved the final version for publication; and agreed to be accountable for all aspects of the work.</w:t>
       </w:r>
     </w:p>
-    <w:bookmarkEnd w:id="29"/>
-    <w:bookmarkStart w:id="30" w:name="X071796dd6bc546c91e96cca1cf5ff96599de61f"/>
+    <w:bookmarkEnd w:id="33"/>
+    <w:bookmarkStart w:id="40" w:name="X071796dd6bc546c91e96cca1cf5ff96599de61f"/>
     <w:p>
       <w:pPr>
         <w:pStyle w:val="Heading2"/>
       </w:pPr>
       <w:r>
-        <w:t xml:space="preserve">0.7 Declaration of generative AI and AI-assisted technologies in the writing process</w:t>
+        <w:t xml:space="preserve">0.6 Declaration of generative AI and AI-assisted technologies in the writing process</w:t>
       </w:r>
     </w:p>
     <w:p>
@@ -9299,8 +9506,769 @@
         <w:t xml:space="preserve">During the preparation of this work the author(s) used Claude from Anthropic in order to improve readability and clarity. After using this tool/service, the author(s) reviewed and edited the content as needed and take(s) full responsibility for the content of the published article.</w:t>
       </w:r>
     </w:p>
-    <w:bookmarkEnd w:id="30"/>
-    <w:bookmarkStart w:id="225" w:name="references"/>
+    <w:tbl>
+      <w:tblPr>
+        <w:tblStyle w:val="Table"/>
+        <w:tblLook w:firstRow="0" w:lastRow="0" w:firstColumn="0" w:lastColumn="0" w:noHBand="0" w:noVBand="0" w:val="0000"/>
+        <w:tblBorders>
+          <w:top w:val="single" w:sz="4" w:space="0" w:color="0758E5"/>
+          <w:left w:val="single" w:sz="24" w:space="0" w:color="0758E5"/>
+          <w:bottom w:val="single" w:sz="4" w:space="0" w:color="0758E5"/>
+          <w:right w:val="single" w:sz="4" w:space="0" w:color="0758E5"/>
+        </w:tblBorders>
+        <w:tblCellMar>
+          <w:left w:w="144" w:type="dxa"/>
+          <w:right w:w="144" w:type="dxa"/>
+        </w:tblCellMar>
+        <w:tblLook w:firstRow="0" w:lastRow="0" w:firstColumn="0" w:lastColumn="0" w:noHBand="0" w:noVBand="0" w:val="0000"/>
+      </w:tblPr>
+      <w:tr>
+        <w:trPr>
+          <w:cantSplit/>
+        </w:trPr>
+        <w:tc>
+          <w:tcPr>
+            <w:shd w:color="auto" w:fill="dae6fb" w:val="clear"/>
+            <w:tcMar>
+              <w:top w:w="92" w:type="dxa"/>
+              <w:bottom w:w="92" w:type="dxa"/>
+            </w:tcMar>
+          </w:tcPr>
+          <w:p>
+            <w:pPr>
+              <w:pStyle w:val="BodyText"/>
+            </w:pPr>
+            <w:pPr>
+              <w:spacing w:before="0" w:after="0"/>
+              <w:textAlignment w:val="center"/>
+            </w:pPr>
+            <w:r>
+              <w:drawing>
+                <wp:inline>
+                  <wp:extent cx="152400" cy="152400"/>
+                  <wp:effectExtent b="0" l="0" r="0" t="0"/>
+                  <wp:docPr descr="" title="" id="34" name="Picture"/>
+                  <a:graphic>
+                    <a:graphicData uri="http://schemas.openxmlformats.org/drawingml/2006/picture">
+                      <pic:pic>
+                        <pic:nvPicPr>
+                          <pic:cNvPr descr="/opt/quarto/share/formats/docx/note.png" id="35" name="Picture"/>
+                          <pic:cNvPicPr>
+                            <a:picLocks noChangeArrowheads="1" noChangeAspect="1"/>
+                          </pic:cNvPicPr>
+                        </pic:nvPicPr>
+                        <pic:blipFill>
+                          <a:blip r:embed="rId9"/>
+                          <a:stretch>
+                            <a:fillRect/>
+                          </a:stretch>
+                        </pic:blipFill>
+                        <pic:spPr bwMode="auto">
+                          <a:xfrm>
+                            <a:off x="0" y="0"/>
+                            <a:ext cx="152400" cy="152400"/>
+                          </a:xfrm>
+                          <a:prstGeom prst="rect">
+                            <a:avLst/>
+                          </a:prstGeom>
+                          <a:noFill/>
+                          <a:ln w="9525">
+                            <a:noFill/>
+                            <a:headEnd/>
+                            <a:tailEnd/>
+                          </a:ln>
+                        </pic:spPr>
+                      </pic:pic>
+                    </a:graphicData>
+                  </a:graphic>
+                </wp:inline>
+              </w:drawing>
+            </w:r>
+            <w:r>
+              <w:t xml:space="preserve"> </w:t>
+            </w:r>
+            <w:r>
+              <w:t xml:space="preserve"> </w:t>
+            </w:r>
+            <w:r>
+              <w:t xml:space="preserve">Outstanding Questions</w:t>
+            </w:r>
+          </w:p>
+        </w:tc>
+      </w:tr>
+      <w:tr>
+        <w:trPr>
+          <w:cantSplit/>
+        </w:trPr>
+        <w:tc>
+          <w:tcPr>
+            <w:tcMar>
+              <w:top w:w="108" w:type="dxa"/>
+              <w:bottom w:w="108" w:type="dxa"/>
+            </w:tcMar>
+          </w:tcPr>
+          <w:p>
+            <w:pPr>
+              <w:numPr>
+                <w:ilvl w:val="0"/>
+                <w:numId w:val="1002"/>
+              </w:numPr>
+            </w:pPr>
+            <w:r>
+              <w:t xml:space="preserve">At what break-even point does the curation cost of a shared dataset get recovered by downstream reuse, and how should that point inform the decision to invest in further sharing versus letting a resource sunset?</w:t>
+            </w:r>
+          </w:p>
+          <w:p>
+            <w:pPr>
+              <w:numPr>
+                <w:ilvl w:val="0"/>
+                <w:numId w:val="1002"/>
+              </w:numPr>
+            </w:pPr>
+            <w:r>
+              <w:t xml:space="preserve">As the data-citation gap persists, what KPI should replace raw citation counts as the primary measure of data-resource impact, and how do we collect it at portfolio scale without burdening individual projects?</w:t>
+            </w:r>
+          </w:p>
+          <w:p>
+            <w:pPr>
+              <w:numPr>
+                <w:ilvl w:val="0"/>
+                <w:numId w:val="1002"/>
+              </w:numPr>
+            </w:pPr>
+            <w:r>
+              <w:t xml:space="preserve">How should cross-disciplinary co-authorship arising from a shared dataset be weighted relative to direct citation when evaluating a resource’s scientific influence?</w:t>
+            </w:r>
+          </w:p>
+          <w:p>
+            <w:pPr>
+              <w:numPr>
+                <w:ilvl w:val="0"/>
+                <w:numId w:val="1002"/>
+              </w:numPr>
+            </w:pPr>
+            <w:r>
+              <w:t xml:space="preserve">What is the right cadence for re-assessing the FAIR maturity of an active data resource, who owns the re-assessment, and how do we keep the process tractable as portfolios grow?</w:t>
+            </w:r>
+          </w:p>
+          <w:p>
+            <w:pPr>
+              <w:numPr>
+                <w:ilvl w:val="0"/>
+                <w:numId w:val="1002"/>
+              </w:numPr>
+            </w:pPr>
+            <w:r>
+              <w:t xml:space="preserve">As AI-driven and agent-based traffic on data portals continues to grow, how do we partition it into noise to remove versus signal to interpret as evidence of resource value?</w:t>
+            </w:r>
+          </w:p>
+          <w:p>
+            <w:pPr>
+              <w:numPr>
+                <w:ilvl w:val="0"/>
+                <w:numId w:val="1002"/>
+              </w:numPr>
+            </w:pPr>
+            <w:r>
+              <w:t xml:space="preserve">What governance structures keep federated evaluation frameworks honest as they evolve, so that metrics continue to serve funders’ strategic questions rather than drifting toward data managers’ reporting convenience?</w:t>
+            </w:r>
+          </w:p>
+          <w:p/>
+        </w:tc>
+      </w:tr>
+    </w:tbl>
+    <w:p>
+      <w:pPr>
+        <w:pStyle w:val="FirstParagraph"/>
+      </w:pPr>
+      <w:r>
+        <w:t xml:space="preserve"> </w:t>
+      </w:r>
+    </w:p>
+    <w:tbl>
+      <w:tblPr>
+        <w:tblStyle w:val="Table"/>
+        <w:tblLook w:firstRow="0" w:lastRow="0" w:firstColumn="0" w:lastColumn="0" w:noHBand="0" w:noVBand="0" w:val="0000"/>
+        <w:tblBorders>
+          <w:top w:val="single" w:sz="4" w:space="0" w:color="0758E5"/>
+          <w:left w:val="single" w:sz="24" w:space="0" w:color="0758E5"/>
+          <w:bottom w:val="single" w:sz="4" w:space="0" w:color="0758E5"/>
+          <w:right w:val="single" w:sz="4" w:space="0" w:color="0758E5"/>
+        </w:tblBorders>
+        <w:tblCellMar>
+          <w:left w:w="144" w:type="dxa"/>
+          <w:right w:w="144" w:type="dxa"/>
+        </w:tblCellMar>
+        <w:tblLook w:firstRow="0" w:lastRow="0" w:firstColumn="0" w:lastColumn="0" w:noHBand="0" w:noVBand="0" w:val="0000"/>
+      </w:tblPr>
+      <w:tr>
+        <w:trPr>
+          <w:cantSplit/>
+        </w:trPr>
+        <w:tc>
+          <w:tcPr>
+            <w:shd w:color="auto" w:fill="dae6fb" w:val="clear"/>
+            <w:tcMar>
+              <w:top w:w="92" w:type="dxa"/>
+              <w:bottom w:w="92" w:type="dxa"/>
+            </w:tcMar>
+          </w:tcPr>
+          <w:p>
+            <w:pPr>
+              <w:pStyle w:val="BodyText"/>
+            </w:pPr>
+            <w:pPr>
+              <w:spacing w:before="0" w:after="0"/>
+              <w:textAlignment w:val="center"/>
+            </w:pPr>
+            <w:r>
+              <w:drawing>
+                <wp:inline>
+                  <wp:extent cx="152400" cy="152400"/>
+                  <wp:effectExtent b="0" l="0" r="0" t="0"/>
+                  <wp:docPr descr="" title="" id="36" name="Picture"/>
+                  <a:graphic>
+                    <a:graphicData uri="http://schemas.openxmlformats.org/drawingml/2006/picture">
+                      <pic:pic>
+                        <pic:nvPicPr>
+                          <pic:cNvPr descr="/opt/quarto/share/formats/docx/note.png" id="37" name="Picture"/>
+                          <pic:cNvPicPr>
+                            <a:picLocks noChangeArrowheads="1" noChangeAspect="1"/>
+                          </pic:cNvPicPr>
+                        </pic:nvPicPr>
+                        <pic:blipFill>
+                          <a:blip r:embed="rId9"/>
+                          <a:stretch>
+                            <a:fillRect/>
+                          </a:stretch>
+                        </pic:blipFill>
+                        <pic:spPr bwMode="auto">
+                          <a:xfrm>
+                            <a:off x="0" y="0"/>
+                            <a:ext cx="152400" cy="152400"/>
+                          </a:xfrm>
+                          <a:prstGeom prst="rect">
+                            <a:avLst/>
+                          </a:prstGeom>
+                          <a:noFill/>
+                          <a:ln w="9525">
+                            <a:noFill/>
+                            <a:headEnd/>
+                            <a:tailEnd/>
+                          </a:ln>
+                        </pic:spPr>
+                      </pic:pic>
+                    </a:graphicData>
+                  </a:graphic>
+                </wp:inline>
+              </w:drawing>
+            </w:r>
+            <w:r>
+              <w:t xml:space="preserve"> </w:t>
+            </w:r>
+            <w:r>
+              <w:t xml:space="preserve"> </w:t>
+            </w:r>
+            <w:r>
+              <w:t xml:space="preserve">Key References</w:t>
+            </w:r>
+          </w:p>
+        </w:tc>
+      </w:tr>
+      <w:tr>
+        <w:trPr>
+          <w:cantSplit/>
+        </w:trPr>
+        <w:tc>
+          <w:tcPr>
+            <w:tcMar>
+              <w:top w:w="108" w:type="dxa"/>
+              <w:bottom w:w="108" w:type="dxa"/>
+            </w:tcMar>
+          </w:tcPr>
+          <w:p>
+            <w:pPr>
+              <w:numPr>
+                <w:ilvl w:val="0"/>
+                <w:numId w:val="1003"/>
+              </w:numPr>
+            </w:pPr>
+            <w:r>
+              <w:t xml:space="preserve">Wilkinson MD et al. The FAIR Guiding Principles for scientific data management and stewardship.</w:t>
+            </w:r>
+            <w:r>
+              <w:t xml:space="preserve"> </w:t>
+            </w:r>
+            <w:r>
+              <w:rPr>
+                <w:i/>
+                <w:iCs/>
+              </w:rPr>
+              <w:t xml:space="preserve">Scientific Data</w:t>
+            </w:r>
+            <w:r>
+              <w:t xml:space="preserve">, 2016</w:t>
+            </w:r>
+            <w:r>
+              <w:t xml:space="preserve"> </w:t>
+            </w:r>
+            <w:r>
+              <w:t xml:space="preserve">[22]</w:t>
+            </w:r>
+            <w:r>
+              <w:t xml:space="preserve">. The foundational definition of the principles that anchor the scientific-quality framework throughout this paper.</w:t>
+            </w:r>
+          </w:p>
+          <w:p>
+            <w:pPr>
+              <w:numPr>
+                <w:ilvl w:val="0"/>
+                <w:numId w:val="1003"/>
+              </w:numPr>
+            </w:pPr>
+            <w:r>
+              <w:t xml:space="preserve">Wilkinson MD et al. A design framework and exemplar metrics for FAIRness.</w:t>
+            </w:r>
+            <w:r>
+              <w:t xml:space="preserve"> </w:t>
+            </w:r>
+            <w:r>
+              <w:rPr>
+                <w:i/>
+                <w:iCs/>
+              </w:rPr>
+              <w:t xml:space="preserve">Scientific Data</w:t>
+            </w:r>
+            <w:r>
+              <w:t xml:space="preserve">, 2018</w:t>
+            </w:r>
+            <w:r>
+              <w:t xml:space="preserve"> </w:t>
+            </w:r>
+            <w:r>
+              <w:t xml:space="preserve">[23]</w:t>
+            </w:r>
+            <w:r>
+              <w:t xml:space="preserve">. Operationalizes FAIR as machine-measurable indicators, which is what makes automated FAIR-compliance monitoring tractable at the portfolio scale we describe.</w:t>
+            </w:r>
+          </w:p>
+          <w:p>
+            <w:pPr>
+              <w:numPr>
+                <w:ilvl w:val="0"/>
+                <w:numId w:val="1003"/>
+              </w:numPr>
+            </w:pPr>
+            <w:r>
+              <w:t xml:space="preserve">Tedersoo L et al. Data sharing practices and data availability upon request differ across scientific disciplines</w:t>
+            </w:r>
+            <w:r>
+              <w:t xml:space="preserve"> </w:t>
+            </w:r>
+            <w:r>
+              <w:t xml:space="preserve">[36]</w:t>
+            </w:r>
+            <w:r>
+              <w:t xml:space="preserve">. Provides the bibliometric evidence that fewer than 30% of secondary analyses formally cite source data, the core empirical basis for our argument that citation-count KPIs systematically understate reuse.</w:t>
+            </w:r>
+          </w:p>
+          <w:p>
+            <w:pPr>
+              <w:numPr>
+                <w:ilvl w:val="0"/>
+                <w:numId w:val="1003"/>
+              </w:numPr>
+            </w:pPr>
+            <w:r>
+              <w:t xml:space="preserve">The GTEx Consortium. The Genotype-Tissue Expression (GTEx) project.</w:t>
+            </w:r>
+            <w:r>
+              <w:t xml:space="preserve"> </w:t>
+            </w:r>
+            <w:r>
+              <w:rPr>
+                <w:i/>
+                <w:iCs/>
+              </w:rPr>
+              <w:t xml:space="preserve">Nature Genetics</w:t>
+            </w:r>
+            <w:r>
+              <w:t xml:space="preserve">, 2013</w:t>
+            </w:r>
+            <w:r>
+              <w:t xml:space="preserve"> </w:t>
+            </w:r>
+            <w:r>
+              <w:t xml:space="preserve">[8]</w:t>
+            </w:r>
+            <w:r>
+              <w:t xml:space="preserve">. The paradigmatic example of a high-reuse public biomedical data resource (8,630 citations as of January 2026), used here to anchor the public-value framework with a concrete case.</w:t>
+            </w:r>
+          </w:p>
+          <w:p>
+            <w:pPr>
+              <w:numPr>
+                <w:ilvl w:val="0"/>
+                <w:numId w:val="1003"/>
+              </w:numPr>
+            </w:pPr>
+            <w:r>
+              <w:t xml:space="preserve">Centers for Disease Control and Prevention. Standard Evaluation Framework for Large Health Care Data</w:t>
+            </w:r>
+            <w:r>
+              <w:t xml:space="preserve"> </w:t>
+            </w:r>
+            <w:r>
+              <w:t xml:space="preserve">[40]</w:t>
+            </w:r>
+            <w:r>
+              <w:t xml:space="preserve">. The 49-attribute fitness-for-purpose framework whose representativeness and linkability attributes are particularly load-bearing for federated ecosystems like the CFDE.</w:t>
+            </w:r>
+          </w:p>
+          <w:p/>
+        </w:tc>
+      </w:tr>
+    </w:tbl>
+    <w:p>
+      <w:pPr>
+        <w:pStyle w:val="FirstParagraph"/>
+      </w:pPr>
+      <w:r>
+        <w:t xml:space="preserve"> </w:t>
+      </w:r>
+    </w:p>
+    <w:tbl>
+      <w:tblPr>
+        <w:tblStyle w:val="Table"/>
+        <w:tblLook w:firstRow="0" w:lastRow="0" w:firstColumn="0" w:lastColumn="0" w:noHBand="0" w:noVBand="0" w:val="0000"/>
+        <w:tblBorders>
+          <w:top w:val="single" w:sz="4" w:space="0" w:color="0758E5"/>
+          <w:left w:val="single" w:sz="24" w:space="0" w:color="0758E5"/>
+          <w:bottom w:val="single" w:sz="4" w:space="0" w:color="0758E5"/>
+          <w:right w:val="single" w:sz="4" w:space="0" w:color="0758E5"/>
+        </w:tblBorders>
+        <w:tblCellMar>
+          <w:left w:w="144" w:type="dxa"/>
+          <w:right w:w="144" w:type="dxa"/>
+        </w:tblCellMar>
+        <w:tblLook w:firstRow="0" w:lastRow="0" w:firstColumn="0" w:lastColumn="0" w:noHBand="0" w:noVBand="0" w:val="0000"/>
+      </w:tblPr>
+      <w:tr>
+        <w:trPr>
+          <w:cantSplit/>
+        </w:trPr>
+        <w:tc>
+          <w:tcPr>
+            <w:shd w:color="auto" w:fill="dae6fb" w:val="clear"/>
+            <w:tcMar>
+              <w:top w:w="92" w:type="dxa"/>
+              <w:bottom w:w="92" w:type="dxa"/>
+            </w:tcMar>
+          </w:tcPr>
+          <w:p>
+            <w:pPr>
+              <w:pStyle w:val="BodyText"/>
+            </w:pPr>
+            <w:pPr>
+              <w:spacing w:before="0" w:after="0"/>
+              <w:textAlignment w:val="center"/>
+            </w:pPr>
+            <w:r>
+              <w:drawing>
+                <wp:inline>
+                  <wp:extent cx="152400" cy="152400"/>
+                  <wp:effectExtent b="0" l="0" r="0" t="0"/>
+                  <wp:docPr descr="" title="" id="38" name="Picture"/>
+                  <a:graphic>
+                    <a:graphicData uri="http://schemas.openxmlformats.org/drawingml/2006/picture">
+                      <pic:pic>
+                        <pic:nvPicPr>
+                          <pic:cNvPr descr="/opt/quarto/share/formats/docx/note.png" id="39" name="Picture"/>
+                          <pic:cNvPicPr>
+                            <a:picLocks noChangeArrowheads="1" noChangeAspect="1"/>
+                          </pic:cNvPicPr>
+                        </pic:nvPicPr>
+                        <pic:blipFill>
+                          <a:blip r:embed="rId9"/>
+                          <a:stretch>
+                            <a:fillRect/>
+                          </a:stretch>
+                        </pic:blipFill>
+                        <pic:spPr bwMode="auto">
+                          <a:xfrm>
+                            <a:off x="0" y="0"/>
+                            <a:ext cx="152400" cy="152400"/>
+                          </a:xfrm>
+                          <a:prstGeom prst="rect">
+                            <a:avLst/>
+                          </a:prstGeom>
+                          <a:noFill/>
+                          <a:ln w="9525">
+                            <a:noFill/>
+                            <a:headEnd/>
+                            <a:tailEnd/>
+                          </a:ln>
+                        </pic:spPr>
+                      </pic:pic>
+                    </a:graphicData>
+                  </a:graphic>
+                </wp:inline>
+              </w:drawing>
+            </w:r>
+            <w:r>
+              <w:t xml:space="preserve"> </w:t>
+            </w:r>
+            <w:r>
+              <w:t xml:space="preserve"> </w:t>
+            </w:r>
+            <w:r>
+              <w:t xml:space="preserve">Glossary</w:t>
+            </w:r>
+          </w:p>
+        </w:tc>
+      </w:tr>
+      <w:tr>
+        <w:trPr>
+          <w:cantSplit/>
+        </w:trPr>
+        <w:tc>
+          <w:tcPr>
+            <w:tcMar>
+              <w:top w:w="108" w:type="dxa"/>
+              <w:bottom w:w="108" w:type="dxa"/>
+            </w:tcMar>
+          </w:tcPr>
+          <w:p>
+            <w:pPr>
+              <w:pStyle w:val="BodyText"/>
+            </w:pPr>
+            <w:pPr>
+              <w:spacing w:before="16"/>
+            </w:pPr>
+            <w:r>
+              <w:rPr>
+                <w:b/>
+                <w:bCs/>
+              </w:rPr>
+              <w:t xml:space="preserve">CFDE</w:t>
+            </w:r>
+            <w:r>
+              <w:t xml:space="preserve"> </w:t>
+            </w:r>
+            <w:r>
+              <w:t xml:space="preserve">(Common Fund Data Ecosystem). NIH cross-cutting initiative that harmonizes metadata and tooling across 19 Common Fund programs so researchers can find and reuse data across the portfolio.</w:t>
+            </w:r>
+          </w:p>
+          <w:p>
+            <w:pPr>
+              <w:pStyle w:val="BodyText"/>
+            </w:pPr>
+            <w:r>
+              <w:rPr>
+                <w:b/>
+                <w:bCs/>
+              </w:rPr>
+              <w:t xml:space="preserve">ICC</w:t>
+            </w:r>
+            <w:r>
+              <w:t xml:space="preserve"> </w:t>
+            </w:r>
+            <w:r>
+              <w:t xml:space="preserve">(Integration and Coordination Center). The CFDE center responsible for cross-portfolio coordination, evaluation, and the centralized metrics dashboard described here.</w:t>
+            </w:r>
+          </w:p>
+          <w:p>
+            <w:pPr>
+              <w:pStyle w:val="BodyText"/>
+            </w:pPr>
+            <w:r>
+              <w:rPr>
+                <w:b/>
+                <w:bCs/>
+              </w:rPr>
+              <w:t xml:space="preserve">DRC, KC, TC, CWIC</w:t>
+            </w:r>
+            <w:r>
+              <w:t xml:space="preserve">. The other four CFDE centers: Data Resource Center (data discovery), Knowledge Center (cross-cutting biological insight), Training Center (skills development), Cloud Workspace Implementation Center (compute infrastructure for in-place analysis).</w:t>
+            </w:r>
+          </w:p>
+          <w:p>
+            <w:pPr>
+              <w:pStyle w:val="BodyText"/>
+            </w:pPr>
+            <w:r>
+              <w:rPr>
+                <w:b/>
+                <w:bCs/>
+              </w:rPr>
+              <w:t xml:space="preserve">FAIR</w:t>
+            </w:r>
+            <w:r>
+              <w:t xml:space="preserve"> </w:t>
+            </w:r>
+            <w:r>
+              <w:t xml:space="preserve">(Findable, Accessible, Interoperable, Reusable). A widely adopted set of principles for making research data reliably reusable.</w:t>
+            </w:r>
+          </w:p>
+          <w:p>
+            <w:pPr>
+              <w:pStyle w:val="BodyText"/>
+            </w:pPr>
+            <w:r>
+              <w:rPr>
+                <w:b/>
+                <w:bCs/>
+              </w:rPr>
+              <w:t xml:space="preserve">FAIRplus-DSM</w:t>
+            </w:r>
+            <w:r>
+              <w:t xml:space="preserve"> </w:t>
+            </w:r>
+            <w:r>
+              <w:t xml:space="preserve">(FAIRplus Dataset Maturity model). A six-level maturity scale that operationalizes the FAIR principles for life-sciences data, from Level 0 (no identifiers, local storage) to Level 5 (enterprise lifecycle management).</w:t>
+            </w:r>
+          </w:p>
+          <w:p>
+            <w:pPr>
+              <w:pStyle w:val="BodyText"/>
+            </w:pPr>
+            <w:r>
+              <w:rPr>
+                <w:b/>
+                <w:bCs/>
+              </w:rPr>
+              <w:t xml:space="preserve">RDA</w:t>
+            </w:r>
+            <w:r>
+              <w:t xml:space="preserve"> </w:t>
+            </w:r>
+            <w:r>
+              <w:t xml:space="preserve">(Research Data Alliance). International community that classifies FAIR indicators by priority — Essential, Important, Useful — and provides a tiered roadmap for incremental improvement.</w:t>
+            </w:r>
+          </w:p>
+          <w:p>
+            <w:pPr>
+              <w:pStyle w:val="BodyText"/>
+            </w:pPr>
+            <w:r>
+              <w:rPr>
+                <w:b/>
+                <w:bCs/>
+              </w:rPr>
+              <w:t xml:space="preserve">RICE, MoSCoW, MCDA</w:t>
+            </w:r>
+            <w:r>
+              <w:t xml:space="preserve">. Product-management prioritization frameworks. RICE scores work by Reach × Impact × Confidence / Effort. MoSCoW labels items Must-have, Should-have, Could-have, Won’t-have. MCDA (Multi-Criteria Decision Analysis) combines multiple weighted dimensions into a composite score.</w:t>
+            </w:r>
+          </w:p>
+          <w:p>
+            <w:pPr>
+              <w:pStyle w:val="BodyText"/>
+            </w:pPr>
+            <w:r>
+              <w:rPr>
+                <w:b/>
+                <w:bCs/>
+              </w:rPr>
+              <w:t xml:space="preserve">ELIXIR</w:t>
+            </w:r>
+            <w:r>
+              <w:t xml:space="preserve">. The European life-sciences research infrastructure, which publishes a ten-metric framework for evaluating bioinformatics software (version control, discoverability, automated builds, test data, documentation, and more).</w:t>
+            </w:r>
+          </w:p>
+          <w:p>
+            <w:pPr>
+              <w:pStyle w:val="BodyText"/>
+            </w:pPr>
+            <w:r>
+              <w:rPr>
+                <w:b/>
+                <w:bCs/>
+              </w:rPr>
+              <w:t xml:space="preserve">GA4GH</w:t>
+            </w:r>
+            <w:r>
+              <w:t xml:space="preserve"> </w:t>
+            </w:r>
+            <w:r>
+              <w:t xml:space="preserve">(Global Alliance for Genomics and Health). International standards organization whose</w:t>
+            </w:r>
+            <w:r>
+              <w:t xml:space="preserve"> </w:t>
+            </w:r>
+            <w:r>
+              <w:t xml:space="preserve">“Driver Projects”</w:t>
+            </w:r>
+            <w:r>
+              <w:t xml:space="preserve"> </w:t>
+            </w:r>
+            <w:r>
+              <w:t xml:space="preserve">model — small pilots that road-test new standards before portfolio-wide adoption — informs the CFDE’s Metrics Working Group.</w:t>
+            </w:r>
+          </w:p>
+          <w:p>
+            <w:pPr>
+              <w:pStyle w:val="BodyText"/>
+            </w:pPr>
+            <w:r>
+              <w:rPr>
+                <w:b/>
+                <w:bCs/>
+              </w:rPr>
+              <w:t xml:space="preserve">PIsCO</w:t>
+            </w:r>
+            <w:r>
+              <w:t xml:space="preserve"> </w:t>
+            </w:r>
+            <w:r>
+              <w:t xml:space="preserve">(Performance Indicators framework for Collection of bioinformatics resource metrics). Server-side framework for automated collection and visualization of software-quality metrics, allowing software health to feed an evaluation dashboard directly.</w:t>
+            </w:r>
+          </w:p>
+          <w:p>
+            <w:pPr>
+              <w:pStyle w:val="BodyText"/>
+            </w:pPr>
+            <w:r>
+              <w:rPr>
+                <w:b/>
+                <w:bCs/>
+              </w:rPr>
+              <w:t xml:space="preserve">RCR</w:t>
+            </w:r>
+            <w:r>
+              <w:t xml:space="preserve"> </w:t>
+            </w:r>
+            <w:r>
+              <w:t xml:space="preserve">(Relative Citation Ratio). NIH iCite metric that benchmarks an article’s citations against expectations for its field.</w:t>
+            </w:r>
+          </w:p>
+          <w:p>
+            <w:pPr>
+              <w:pStyle w:val="BodyText"/>
+            </w:pPr>
+            <w:pPr>
+              <w:spacing w:after="16"/>
+            </w:pPr>
+            <w:r>
+              <w:rPr>
+                <w:b/>
+                <w:bCs/>
+              </w:rPr>
+              <w:t xml:space="preserve">DMS Policy</w:t>
+            </w:r>
+            <w:r>
+              <w:t xml:space="preserve"> </w:t>
+            </w:r>
+            <w:r>
+              <w:t xml:space="preserve">(NIH Data Management and Sharing Policy). The 2023 NIH policy requiring grantees to plan for data sharing, which establishes a pre-policy baseline against which sharing and reuse improvements can be measured.</w:t>
+            </w:r>
+          </w:p>
+          <w:p/>
+        </w:tc>
+      </w:tr>
+    </w:tbl>
+    <w:bookmarkEnd w:id="40"/>
+    <w:bookmarkStart w:id="235" w:name="references"/>
     <w:p>
       <w:pPr>
         <w:pStyle w:val="Heading1"/>
@@ -9309,8 +10277,8 @@
         <w:t xml:space="preserve">References</w:t>
       </w:r>
     </w:p>
-    <w:bookmarkStart w:id="224" w:name="refs"/>
-    <w:bookmarkStart w:id="35" w:name="ref-doi:10.3389/fcell.2017.00083"/>
+    <w:bookmarkStart w:id="234" w:name="refs"/>
+    <w:bookmarkStart w:id="45" w:name="ref-doi:10.3389/fcell.2017.00083"/>
     <w:p>
       <w:pPr>
         <w:pStyle w:val="Bibliography"/>
@@ -9356,7 +10324,7 @@
       <w:r>
         <w:t xml:space="preserve"> </w:t>
       </w:r>
-      <w:hyperlink r:id="rId31">
+      <w:hyperlink r:id="rId41">
         <w:r>
           <w:rPr>
             <w:rStyle w:val="Hyperlink"/>
@@ -9373,7 +10341,7 @@
       <w:r>
         <w:t xml:space="preserve"> </w:t>
       </w:r>
-      <w:hyperlink r:id="rId32">
+      <w:hyperlink r:id="rId42">
         <w:r>
           <w:rPr>
             <w:rStyle w:val="Hyperlink"/>
@@ -9390,7 +10358,7 @@
       <w:r>
         <w:t xml:space="preserve"> </w:t>
       </w:r>
-      <w:hyperlink r:id="rId33">
+      <w:hyperlink r:id="rId43">
         <w:r>
           <w:rPr>
             <w:rStyle w:val="Hyperlink"/>
@@ -9407,7 +10375,7 @@
       <w:r>
         <w:t xml:space="preserve"> </w:t>
       </w:r>
-      <w:hyperlink r:id="rId34">
+      <w:hyperlink r:id="rId44">
         <w:r>
           <w:rPr>
             <w:rStyle w:val="Hyperlink"/>
@@ -9416,8 +10384,8 @@
         </w:r>
       </w:hyperlink>
     </w:p>
-    <w:bookmarkEnd w:id="35"/>
-    <w:bookmarkStart w:id="39" w:name="ref-pmid:24071849"/>
+    <w:bookmarkEnd w:id="45"/>
+    <w:bookmarkStart w:id="49" w:name="ref-pmid:24071849"/>
     <w:p>
       <w:pPr>
         <w:pStyle w:val="Bibliography"/>
@@ -9460,7 +10428,7 @@
       <w:r>
         <w:t xml:space="preserve"> </w:t>
       </w:r>
-      <w:hyperlink r:id="rId36">
+      <w:hyperlink r:id="rId46">
         <w:r>
           <w:rPr>
             <w:rStyle w:val="Hyperlink"/>
@@ -9477,7 +10445,7 @@
       <w:r>
         <w:t xml:space="preserve"> </w:t>
       </w:r>
-      <w:hyperlink r:id="rId37">
+      <w:hyperlink r:id="rId47">
         <w:r>
           <w:rPr>
             <w:rStyle w:val="Hyperlink"/>
@@ -9494,7 +10462,7 @@
       <w:r>
         <w:t xml:space="preserve"> </w:t>
       </w:r>
-      <w:hyperlink r:id="rId36">
+      <w:hyperlink r:id="rId46">
         <w:r>
           <w:rPr>
             <w:rStyle w:val="Hyperlink"/>
@@ -9511,7 +10479,7 @@
       <w:r>
         <w:t xml:space="preserve"> </w:t>
       </w:r>
-      <w:hyperlink r:id="rId38">
+      <w:hyperlink r:id="rId48">
         <w:r>
           <w:rPr>
             <w:rStyle w:val="Hyperlink"/>
@@ -9520,8 +10488,8 @@
         </w:r>
       </w:hyperlink>
     </w:p>
-    <w:bookmarkEnd w:id="39"/>
-    <w:bookmarkStart w:id="44" w:name="ref-doi:10.1038/s41586-021-03205-y"/>
+    <w:bookmarkEnd w:id="49"/>
+    <w:bookmarkStart w:id="54" w:name="ref-doi:10.1038/s41586-021-03205-y"/>
     <w:p>
       <w:pPr>
         <w:pStyle w:val="Bibliography"/>
@@ -9567,7 +10535,7 @@
       <w:r>
         <w:t xml:space="preserve"> </w:t>
       </w:r>
-      <w:hyperlink r:id="rId40">
+      <w:hyperlink r:id="rId50">
         <w:r>
           <w:rPr>
             <w:rStyle w:val="Hyperlink"/>
@@ -9584,7 +10552,7 @@
       <w:r>
         <w:t xml:space="preserve"> </w:t>
       </w:r>
-      <w:hyperlink r:id="rId41">
+      <w:hyperlink r:id="rId51">
         <w:r>
           <w:rPr>
             <w:rStyle w:val="Hyperlink"/>
@@ -9601,7 +10569,7 @@
       <w:r>
         <w:t xml:space="preserve"> </w:t>
       </w:r>
-      <w:hyperlink r:id="rId42">
+      <w:hyperlink r:id="rId52">
         <w:r>
           <w:rPr>
             <w:rStyle w:val="Hyperlink"/>
@@ -9618,7 +10586,7 @@
       <w:r>
         <w:t xml:space="preserve"> </w:t>
       </w:r>
-      <w:hyperlink r:id="rId43">
+      <w:hyperlink r:id="rId53">
         <w:r>
           <w:rPr>
             <w:rStyle w:val="Hyperlink"/>
@@ -9627,8 +10595,8 @@
         </w:r>
       </w:hyperlink>
     </w:p>
-    <w:bookmarkEnd w:id="44"/>
-    <w:bookmarkStart w:id="48" w:name="ref-doi:10.1056/NEJMsr1809937"/>
+    <w:bookmarkEnd w:id="54"/>
+    <w:bookmarkStart w:id="58" w:name="ref-doi:10.1056/NEJMsr1809937"/>
     <w:p>
       <w:pPr>
         <w:pStyle w:val="Bibliography"/>
@@ -9696,7 +10664,7 @@
       <w:r>
         <w:t xml:space="preserve"> </w:t>
       </w:r>
-      <w:hyperlink r:id="rId45">
+      <w:hyperlink r:id="rId55">
         <w:r>
           <w:rPr>
             <w:rStyle w:val="Hyperlink"/>
@@ -9713,7 +10681,7 @@
       <w:r>
         <w:t xml:space="preserve"> </w:t>
       </w:r>
-      <w:hyperlink r:id="rId46">
+      <w:hyperlink r:id="rId56">
         <w:r>
           <w:rPr>
             <w:rStyle w:val="Hyperlink"/>
@@ -9730,7 +10698,7 @@
       <w:r>
         <w:t xml:space="preserve"> </w:t>
       </w:r>
-      <w:hyperlink r:id="rId47">
+      <w:hyperlink r:id="rId57">
         <w:r>
           <w:rPr>
             <w:rStyle w:val="Hyperlink"/>
@@ -9739,8 +10707,8 @@
         </w:r>
       </w:hyperlink>
     </w:p>
-    <w:bookmarkEnd w:id="48"/>
-    <w:bookmarkStart w:id="52" w:name="ref-doi:10.1158/0008-5472.CAN-17-0387"/>
+    <w:bookmarkEnd w:id="58"/>
+    <w:bookmarkStart w:id="62" w:name="ref-doi:10.1158/0008-5472.CAN-17-0387"/>
     <w:p>
       <w:pPr>
         <w:pStyle w:val="Bibliography"/>
@@ -9786,7 +10754,7 @@
       <w:r>
         <w:t xml:space="preserve"> </w:t>
       </w:r>
-      <w:hyperlink r:id="rId49">
+      <w:hyperlink r:id="rId59">
         <w:r>
           <w:rPr>
             <w:rStyle w:val="Hyperlink"/>
@@ -9803,7 +10771,7 @@
       <w:r>
         <w:t xml:space="preserve"> </w:t>
       </w:r>
-      <w:hyperlink r:id="rId50">
+      <w:hyperlink r:id="rId60">
         <w:r>
           <w:rPr>
             <w:rStyle w:val="Hyperlink"/>
@@ -9820,7 +10788,7 @@
       <w:r>
         <w:t xml:space="preserve"> </w:t>
       </w:r>
-      <w:hyperlink r:id="rId51">
+      <w:hyperlink r:id="rId61">
         <w:r>
           <w:rPr>
             <w:rStyle w:val="Hyperlink"/>
@@ -9829,8 +10797,8 @@
         </w:r>
       </w:hyperlink>
     </w:p>
-    <w:bookmarkEnd w:id="52"/>
-    <w:bookmarkStart w:id="55" w:name="ref-doi:10.5281/zenodo.3822858"/>
+    <w:bookmarkEnd w:id="62"/>
+    <w:bookmarkStart w:id="65" w:name="ref-doi:10.5281/zenodo.3822858"/>
     <w:p>
       <w:pPr>
         <w:pStyle w:val="Bibliography"/>
@@ -9876,7 +10844,7 @@
       <w:r>
         <w:t xml:space="preserve"> </w:t>
       </w:r>
-      <w:hyperlink r:id="rId53">
+      <w:hyperlink r:id="rId63">
         <w:r>
           <w:rPr>
             <w:rStyle w:val="Hyperlink"/>
@@ -9893,7 +10861,7 @@
       <w:r>
         <w:t xml:space="preserve"> </w:t>
       </w:r>
-      <w:hyperlink r:id="rId54">
+      <w:hyperlink r:id="rId64">
         <w:r>
           <w:rPr>
             <w:rStyle w:val="Hyperlink"/>
@@ -9902,8 +10870,8 @@
         </w:r>
       </w:hyperlink>
     </w:p>
-    <w:bookmarkEnd w:id="55"/>
-    <w:bookmarkStart w:id="60" w:name="ref-doi:10.1016/j.xgen.2021.100085"/>
+    <w:bookmarkEnd w:id="65"/>
+    <w:bookmarkStart w:id="70" w:name="ref-doi:10.1016/j.xgen.2021.100085"/>
     <w:p>
       <w:pPr>
         <w:pStyle w:val="Bibliography"/>
@@ -9949,7 +10917,7 @@
       <w:r>
         <w:t xml:space="preserve"> </w:t>
       </w:r>
-      <w:hyperlink r:id="rId56">
+      <w:hyperlink r:id="rId66">
         <w:r>
           <w:rPr>
             <w:rStyle w:val="Hyperlink"/>
@@ -9966,7 +10934,7 @@
       <w:r>
         <w:t xml:space="preserve"> </w:t>
       </w:r>
-      <w:hyperlink r:id="rId57">
+      <w:hyperlink r:id="rId67">
         <w:r>
           <w:rPr>
             <w:rStyle w:val="Hyperlink"/>
@@ -9983,7 +10951,7 @@
       <w:r>
         <w:t xml:space="preserve"> </w:t>
       </w:r>
-      <w:hyperlink r:id="rId58">
+      <w:hyperlink r:id="rId68">
         <w:r>
           <w:rPr>
             <w:rStyle w:val="Hyperlink"/>
@@ -10000,7 +10968,7 @@
       <w:r>
         <w:t xml:space="preserve"> </w:t>
       </w:r>
-      <w:hyperlink r:id="rId59">
+      <w:hyperlink r:id="rId69">
         <w:r>
           <w:rPr>
             <w:rStyle w:val="Hyperlink"/>
@@ -10009,8 +10977,8 @@
         </w:r>
       </w:hyperlink>
     </w:p>
-    <w:bookmarkEnd w:id="60"/>
-    <w:bookmarkStart w:id="65" w:name="ref-doi:10.1038/ng.2653"/>
+    <w:bookmarkEnd w:id="70"/>
+    <w:bookmarkStart w:id="75" w:name="ref-doi:10.1038/ng.2653"/>
     <w:p>
       <w:pPr>
         <w:pStyle w:val="Bibliography"/>
@@ -10056,7 +11024,7 @@
       <w:r>
         <w:t xml:space="preserve"> </w:t>
       </w:r>
-      <w:hyperlink r:id="rId61">
+      <w:hyperlink r:id="rId71">
         <w:r>
           <w:rPr>
             <w:rStyle w:val="Hyperlink"/>
@@ -10073,7 +11041,7 @@
       <w:r>
         <w:t xml:space="preserve"> </w:t>
       </w:r>
-      <w:hyperlink r:id="rId62">
+      <w:hyperlink r:id="rId72">
         <w:r>
           <w:rPr>
             <w:rStyle w:val="Hyperlink"/>
@@ -10090,7 +11058,7 @@
       <w:r>
         <w:t xml:space="preserve"> </w:t>
       </w:r>
-      <w:hyperlink r:id="rId63">
+      <w:hyperlink r:id="rId73">
         <w:r>
           <w:rPr>
             <w:rStyle w:val="Hyperlink"/>
@@ -10107,7 +11075,7 @@
       <w:r>
         <w:t xml:space="preserve"> </w:t>
       </w:r>
-      <w:hyperlink r:id="rId64">
+      <w:hyperlink r:id="rId74">
         <w:r>
           <w:rPr>
             <w:rStyle w:val="Hyperlink"/>
@@ -10116,8 +11084,8 @@
         </w:r>
       </w:hyperlink>
     </w:p>
-    <w:bookmarkEnd w:id="65"/>
-    <w:bookmarkStart w:id="70" w:name="ref-doi:10.1038/nature11234"/>
+    <w:bookmarkEnd w:id="75"/>
+    <w:bookmarkStart w:id="80" w:name="ref-doi:10.1038/nature11234"/>
     <w:p>
       <w:pPr>
         <w:pStyle w:val="Bibliography"/>
@@ -10157,7 +11125,7 @@
       <w:r>
         <w:t xml:space="preserve"> </w:t>
       </w:r>
-      <w:hyperlink r:id="rId66">
+      <w:hyperlink r:id="rId76">
         <w:r>
           <w:rPr>
             <w:rStyle w:val="Hyperlink"/>
@@ -10174,7 +11142,7 @@
       <w:r>
         <w:t xml:space="preserve"> </w:t>
       </w:r>
-      <w:hyperlink r:id="rId67">
+      <w:hyperlink r:id="rId77">
         <w:r>
           <w:rPr>
             <w:rStyle w:val="Hyperlink"/>
@@ -10191,7 +11159,7 @@
       <w:r>
         <w:t xml:space="preserve"> </w:t>
       </w:r>
-      <w:hyperlink r:id="rId68">
+      <w:hyperlink r:id="rId78">
         <w:r>
           <w:rPr>
             <w:rStyle w:val="Hyperlink"/>
@@ -10208,7 +11176,7 @@
       <w:r>
         <w:t xml:space="preserve"> </w:t>
       </w:r>
-      <w:hyperlink r:id="rId69">
+      <w:hyperlink r:id="rId79">
         <w:r>
           <w:rPr>
             <w:rStyle w:val="Hyperlink"/>
@@ -10217,8 +11185,8 @@
         </w:r>
       </w:hyperlink>
     </w:p>
-    <w:bookmarkEnd w:id="70"/>
-    <w:bookmarkStart w:id="75" w:name="ref-doi:10.1038/nature11209"/>
+    <w:bookmarkEnd w:id="80"/>
+    <w:bookmarkStart w:id="85" w:name="ref-doi:10.1038/nature11209"/>
     <w:p>
       <w:pPr>
         <w:pStyle w:val="Bibliography"/>
@@ -10258,7 +11226,7 @@
       <w:r>
         <w:t xml:space="preserve"> </w:t>
       </w:r>
-      <w:hyperlink r:id="rId71">
+      <w:hyperlink r:id="rId81">
         <w:r>
           <w:rPr>
             <w:rStyle w:val="Hyperlink"/>
@@ -10275,7 +11243,7 @@
       <w:r>
         <w:t xml:space="preserve"> </w:t>
       </w:r>
-      <w:hyperlink r:id="rId72">
+      <w:hyperlink r:id="rId82">
         <w:r>
           <w:rPr>
             <w:rStyle w:val="Hyperlink"/>
@@ -10292,7 +11260,7 @@
       <w:r>
         <w:t xml:space="preserve"> </w:t>
       </w:r>
-      <w:hyperlink r:id="rId73">
+      <w:hyperlink r:id="rId83">
         <w:r>
           <w:rPr>
             <w:rStyle w:val="Hyperlink"/>
@@ -10309,7 +11277,7 @@
       <w:r>
         <w:t xml:space="preserve"> </w:t>
       </w:r>
-      <w:hyperlink r:id="rId74">
+      <w:hyperlink r:id="rId84">
         <w:r>
           <w:rPr>
             <w:rStyle w:val="Hyperlink"/>
@@ -10318,8 +11286,8 @@
         </w:r>
       </w:hyperlink>
     </w:p>
-    <w:bookmarkEnd w:id="75"/>
-    <w:bookmarkStart w:id="79" w:name="ref-pmid:31597973"/>
+    <w:bookmarkEnd w:id="85"/>
+    <w:bookmarkStart w:id="89" w:name="ref-pmid:31597973"/>
     <w:p>
       <w:pPr>
         <w:pStyle w:val="Bibliography"/>
@@ -10359,7 +11327,7 @@
       <w:r>
         <w:t xml:space="preserve"> </w:t>
       </w:r>
-      <w:hyperlink r:id="rId76">
+      <w:hyperlink r:id="rId86">
         <w:r>
           <w:rPr>
             <w:rStyle w:val="Hyperlink"/>
@@ -10376,7 +11344,7 @@
       <w:r>
         <w:t xml:space="preserve"> </w:t>
       </w:r>
-      <w:hyperlink r:id="rId77">
+      <w:hyperlink r:id="rId87">
         <w:r>
           <w:rPr>
             <w:rStyle w:val="Hyperlink"/>
@@ -10393,7 +11361,7 @@
       <w:r>
         <w:t xml:space="preserve"> </w:t>
       </w:r>
-      <w:hyperlink r:id="rId76">
+      <w:hyperlink r:id="rId86">
         <w:r>
           <w:rPr>
             <w:rStyle w:val="Hyperlink"/>
@@ -10410,7 +11378,7 @@
       <w:r>
         <w:t xml:space="preserve"> </w:t>
       </w:r>
-      <w:hyperlink r:id="rId78">
+      <w:hyperlink r:id="rId88">
         <w:r>
           <w:rPr>
             <w:rStyle w:val="Hyperlink"/>
@@ -10419,8 +11387,8 @@
         </w:r>
       </w:hyperlink>
     </w:p>
-    <w:bookmarkEnd w:id="79"/>
-    <w:bookmarkStart w:id="84" w:name="ref-doi:10.1093/glycob/cwz080"/>
+    <w:bookmarkEnd w:id="89"/>
+    <w:bookmarkStart w:id="94" w:name="ref-doi:10.1093/glycob/cwz080"/>
     <w:p>
       <w:pPr>
         <w:pStyle w:val="Bibliography"/>
@@ -10466,7 +11434,7 @@
       <w:r>
         <w:t xml:space="preserve"> </w:t>
       </w:r>
-      <w:hyperlink r:id="rId80">
+      <w:hyperlink r:id="rId90">
         <w:r>
           <w:rPr>
             <w:rStyle w:val="Hyperlink"/>
@@ -10483,7 +11451,7 @@
       <w:r>
         <w:t xml:space="preserve"> </w:t>
       </w:r>
-      <w:hyperlink r:id="rId81">
+      <w:hyperlink r:id="rId91">
         <w:r>
           <w:rPr>
             <w:rStyle w:val="Hyperlink"/>
@@ -10500,7 +11468,7 @@
       <w:r>
         <w:t xml:space="preserve"> </w:t>
       </w:r>
-      <w:hyperlink r:id="rId82">
+      <w:hyperlink r:id="rId92">
         <w:r>
           <w:rPr>
             <w:rStyle w:val="Hyperlink"/>
@@ -10517,7 +11485,7 @@
       <w:r>
         <w:t xml:space="preserve"> </w:t>
       </w:r>
-      <w:hyperlink r:id="rId83">
+      <w:hyperlink r:id="rId93">
         <w:r>
           <w:rPr>
             <w:rStyle w:val="Hyperlink"/>
@@ -10526,8 +11494,8 @@
         </w:r>
       </w:hyperlink>
     </w:p>
-    <w:bookmarkEnd w:id="84"/>
-    <w:bookmarkStart w:id="89" w:name="ref-doi:10.1101/2024.03.11.584478"/>
+    <w:bookmarkEnd w:id="94"/>
+    <w:bookmarkStart w:id="99" w:name="ref-doi:10.1101/2024.03.11.584478"/>
     <w:p>
       <w:pPr>
         <w:pStyle w:val="Bibliography"/>
@@ -10603,7 +11571,7 @@
       <w:r>
         <w:t xml:space="preserve"> </w:t>
       </w:r>
-      <w:hyperlink r:id="rId85">
+      <w:hyperlink r:id="rId95">
         <w:r>
           <w:rPr>
             <w:rStyle w:val="Hyperlink"/>
@@ -10620,7 +11588,7 @@
       <w:r>
         <w:t xml:space="preserve"> </w:t>
       </w:r>
-      <w:hyperlink r:id="rId86">
+      <w:hyperlink r:id="rId96">
         <w:r>
           <w:rPr>
             <w:rStyle w:val="Hyperlink"/>
@@ -10637,7 +11605,7 @@
       <w:r>
         <w:t xml:space="preserve"> </w:t>
       </w:r>
-      <w:hyperlink r:id="rId87">
+      <w:hyperlink r:id="rId97">
         <w:r>
           <w:rPr>
             <w:rStyle w:val="Hyperlink"/>
@@ -10654,7 +11622,7 @@
       <w:r>
         <w:t xml:space="preserve"> </w:t>
       </w:r>
-      <w:hyperlink r:id="rId88">
+      <w:hyperlink r:id="rId98">
         <w:r>
           <w:rPr>
             <w:rStyle w:val="Hyperlink"/>
@@ -10663,8 +11631,8 @@
         </w:r>
       </w:hyperlink>
     </w:p>
-    <w:bookmarkEnd w:id="89"/>
-    <w:bookmarkStart w:id="94" w:name="ref-doi:10.1093/gigascience/giac105"/>
+    <w:bookmarkEnd w:id="99"/>
+    <w:bookmarkStart w:id="104" w:name="ref-doi:10.1093/gigascience/giac105"/>
     <w:p>
       <w:pPr>
         <w:pStyle w:val="Bibliography"/>
@@ -10710,7 +11678,7 @@
       <w:r>
         <w:t xml:space="preserve"> </w:t>
       </w:r>
-      <w:hyperlink r:id="rId90">
+      <w:hyperlink r:id="rId100">
         <w:r>
           <w:rPr>
             <w:rStyle w:val="Hyperlink"/>
@@ -10727,7 +11695,7 @@
       <w:r>
         <w:t xml:space="preserve"> </w:t>
       </w:r>
-      <w:hyperlink r:id="rId91">
+      <w:hyperlink r:id="rId101">
         <w:r>
           <w:rPr>
             <w:rStyle w:val="Hyperlink"/>
@@ -10744,7 +11712,7 @@
       <w:r>
         <w:t xml:space="preserve"> </w:t>
       </w:r>
-      <w:hyperlink r:id="rId92">
+      <w:hyperlink r:id="rId102">
         <w:r>
           <w:rPr>
             <w:rStyle w:val="Hyperlink"/>
@@ -10761,7 +11729,7 @@
       <w:r>
         <w:t xml:space="preserve"> </w:t>
       </w:r>
-      <w:hyperlink r:id="rId93">
+      <w:hyperlink r:id="rId103">
         <w:r>
           <w:rPr>
             <w:rStyle w:val="Hyperlink"/>
@@ -10770,8 +11738,8 @@
         </w:r>
       </w:hyperlink>
     </w:p>
-    <w:bookmarkEnd w:id="94"/>
-    <w:bookmarkStart w:id="96" w:name="X7a93631224c49a632e3119c84b1b3a6b629c733"/>
+    <w:bookmarkEnd w:id="104"/>
+    <w:bookmarkStart w:id="106" w:name="X7a93631224c49a632e3119c84b1b3a6b629c733"/>
     <w:p>
       <w:pPr>
         <w:pStyle w:val="Bibliography"/>
@@ -10785,7 +11753,7 @@
       <w:r>
         <w:t xml:space="preserve">	</w:t>
       </w:r>
-      <w:hyperlink r:id="rId95">
+      <w:hyperlink r:id="rId105">
         <w:r>
           <w:rPr>
             <w:rStyle w:val="Hyperlink"/>
@@ -10794,8 +11762,8 @@
         </w:r>
       </w:hyperlink>
     </w:p>
-    <w:bookmarkEnd w:id="96"/>
-    <w:bookmarkStart w:id="98" w:name="Xbd435956a17184c05f78812072a6977d95df0e7"/>
+    <w:bookmarkEnd w:id="106"/>
+    <w:bookmarkStart w:id="108" w:name="Xbd435956a17184c05f78812072a6977d95df0e7"/>
     <w:p>
       <w:pPr>
         <w:pStyle w:val="Bibliography"/>
@@ -10841,7 +11809,7 @@
       <w:r>
         <w:t xml:space="preserve"> </w:t>
       </w:r>
-      <w:hyperlink r:id="rId97">
+      <w:hyperlink r:id="rId107">
         <w:r>
           <w:rPr>
             <w:rStyle w:val="Hyperlink"/>
@@ -10850,8 +11818,8 @@
         </w:r>
       </w:hyperlink>
     </w:p>
-    <w:bookmarkEnd w:id="98"/>
-    <w:bookmarkStart w:id="99" w:name="ref-isbn:9780201624328"/>
+    <w:bookmarkEnd w:id="108"/>
+    <w:bookmarkStart w:id="109" w:name="ref-isbn:9780201624328"/>
     <w:p>
       <w:pPr>
         <w:pStyle w:val="Bibliography"/>
@@ -10901,8 +11869,8 @@
         <w:t xml:space="preserve">ISBN: 9780201624328</w:t>
       </w:r>
     </w:p>
-    <w:bookmarkEnd w:id="99"/>
-    <w:bookmarkStart w:id="100" w:name="ref-isbn:9780875846514"/>
+    <w:bookmarkEnd w:id="109"/>
+    <w:bookmarkStart w:id="110" w:name="ref-isbn:9780875846514"/>
     <w:p>
       <w:pPr>
         <w:pStyle w:val="Bibliography"/>
@@ -10952,8 +11920,8 @@
         <w:t xml:space="preserve">ISBN: 9780875846514</w:t>
       </w:r>
     </w:p>
-    <w:bookmarkEnd w:id="100"/>
-    <w:bookmarkStart w:id="101" w:name="ref-isbn:9780273653349"/>
+    <w:bookmarkEnd w:id="110"/>
+    <w:bookmarkStart w:id="111" w:name="ref-isbn:9780273653349"/>
     <w:p>
       <w:pPr>
         <w:pStyle w:val="Bibliography"/>
@@ -11003,8 +11971,8 @@
         <w:t xml:space="preserve">ISBN: 9780273653349</w:t>
       </w:r>
     </w:p>
-    <w:bookmarkEnd w:id="101"/>
-    <w:bookmarkStart w:id="102" w:name="ref-isbn:9780471465102"/>
+    <w:bookmarkEnd w:id="111"/>
+    <w:bookmarkStart w:id="112" w:name="ref-isbn:9780471465102"/>
     <w:p>
       <w:pPr>
         <w:pStyle w:val="Bibliography"/>
@@ -11054,8 +12022,8 @@
         <w:t xml:space="preserve">ISBN: 9780471465102</w:t>
       </w:r>
     </w:p>
-    <w:bookmarkEnd w:id="102"/>
-    <w:bookmarkStart w:id="103" w:name="ref-isbn:9780792375067"/>
+    <w:bookmarkEnd w:id="112"/>
+    <w:bookmarkStart w:id="113" w:name="ref-isbn:9780792375067"/>
     <w:p>
       <w:pPr>
         <w:pStyle w:val="Bibliography"/>
@@ -11105,8 +12073,8 @@
         <w:t xml:space="preserve">ISBN: 9780792375067</w:t>
       </w:r>
     </w:p>
-    <w:bookmarkEnd w:id="103"/>
-    <w:bookmarkStart w:id="108" w:name="ref-doi:10.1038/sdata.2016.18"/>
+    <w:bookmarkEnd w:id="113"/>
+    <w:bookmarkStart w:id="118" w:name="ref-doi:10.1038/sdata.2016.18"/>
     <w:p>
       <w:pPr>
         <w:pStyle w:val="Bibliography"/>
@@ -11152,7 +12120,7 @@
       <w:r>
         <w:t xml:space="preserve"> </w:t>
       </w:r>
-      <w:hyperlink r:id="rId104">
+      <w:hyperlink r:id="rId114">
         <w:r>
           <w:rPr>
             <w:rStyle w:val="Hyperlink"/>
@@ -11169,7 +12137,7 @@
       <w:r>
         <w:t xml:space="preserve"> </w:t>
       </w:r>
-      <w:hyperlink r:id="rId105">
+      <w:hyperlink r:id="rId115">
         <w:r>
           <w:rPr>
             <w:rStyle w:val="Hyperlink"/>
@@ -11186,7 +12154,7 @@
       <w:r>
         <w:t xml:space="preserve"> </w:t>
       </w:r>
-      <w:hyperlink r:id="rId106">
+      <w:hyperlink r:id="rId116">
         <w:r>
           <w:rPr>
             <w:rStyle w:val="Hyperlink"/>
@@ -11203,7 +12171,7 @@
       <w:r>
         <w:t xml:space="preserve"> </w:t>
       </w:r>
-      <w:hyperlink r:id="rId107">
+      <w:hyperlink r:id="rId117">
         <w:r>
           <w:rPr>
             <w:rStyle w:val="Hyperlink"/>
@@ -11212,8 +12180,8 @@
         </w:r>
       </w:hyperlink>
     </w:p>
-    <w:bookmarkEnd w:id="108"/>
-    <w:bookmarkStart w:id="113" w:name="ref-doi:10.1038/sdata.2018.118"/>
+    <w:bookmarkEnd w:id="118"/>
+    <w:bookmarkStart w:id="123" w:name="ref-doi:10.1038/sdata.2018.118"/>
     <w:p>
       <w:pPr>
         <w:pStyle w:val="Bibliography"/>
@@ -11259,7 +12227,7 @@
       <w:r>
         <w:t xml:space="preserve"> </w:t>
       </w:r>
-      <w:hyperlink r:id="rId109">
+      <w:hyperlink r:id="rId119">
         <w:r>
           <w:rPr>
             <w:rStyle w:val="Hyperlink"/>
@@ -11276,7 +12244,7 @@
       <w:r>
         <w:t xml:space="preserve"> </w:t>
       </w:r>
-      <w:hyperlink r:id="rId110">
+      <w:hyperlink r:id="rId120">
         <w:r>
           <w:rPr>
             <w:rStyle w:val="Hyperlink"/>
@@ -11293,7 +12261,7 @@
       <w:r>
         <w:t xml:space="preserve"> </w:t>
       </w:r>
-      <w:hyperlink r:id="rId111">
+      <w:hyperlink r:id="rId121">
         <w:r>
           <w:rPr>
             <w:rStyle w:val="Hyperlink"/>
@@ -11310,7 +12278,7 @@
       <w:r>
         <w:t xml:space="preserve"> </w:t>
       </w:r>
-      <w:hyperlink r:id="rId112">
+      <w:hyperlink r:id="rId122">
         <w:r>
           <w:rPr>
             <w:rStyle w:val="Hyperlink"/>
@@ -11319,8 +12287,8 @@
         </w:r>
       </w:hyperlink>
     </w:p>
-    <w:bookmarkEnd w:id="113"/>
-    <w:bookmarkStart w:id="115" w:name="X0c476e0dc488839bbf9fe4bc72ce2e5c6de7346"/>
+    <w:bookmarkEnd w:id="123"/>
+    <w:bookmarkStart w:id="125" w:name="X0c476e0dc488839bbf9fe4bc72ce2e5c6de7346"/>
     <w:p>
       <w:pPr>
         <w:pStyle w:val="Bibliography"/>
@@ -11350,7 +12318,7 @@
       <w:r>
         <w:t xml:space="preserve"> </w:t>
       </w:r>
-      <w:hyperlink r:id="rId114">
+      <w:hyperlink r:id="rId124">
         <w:r>
           <w:rPr>
             <w:rStyle w:val="Hyperlink"/>
@@ -11359,8 +12327,8 @@
         </w:r>
       </w:hyperlink>
     </w:p>
-    <w:bookmarkEnd w:id="115"/>
-    <w:bookmarkStart w:id="117" w:name="ref-url:https://matomo.org"/>
+    <w:bookmarkEnd w:id="125"/>
+    <w:bookmarkStart w:id="127" w:name="ref-url:https://matomo.org"/>
     <w:p>
       <w:pPr>
         <w:pStyle w:val="Bibliography"/>
@@ -11390,7 +12358,7 @@
       <w:r>
         <w:t xml:space="preserve"> </w:t>
       </w:r>
-      <w:hyperlink r:id="rId116">
+      <w:hyperlink r:id="rId126">
         <w:r>
           <w:rPr>
             <w:rStyle w:val="Hyperlink"/>
@@ -11399,8 +12367,8 @@
         </w:r>
       </w:hyperlink>
     </w:p>
-    <w:bookmarkEnd w:id="117"/>
-    <w:bookmarkStart w:id="119" w:name="ref-url:https://semrush.com"/>
+    <w:bookmarkEnd w:id="127"/>
+    <w:bookmarkStart w:id="129" w:name="ref-url:https://semrush.com"/>
     <w:p>
       <w:pPr>
         <w:pStyle w:val="Bibliography"/>
@@ -11430,7 +12398,7 @@
       <w:r>
         <w:t xml:space="preserve"> </w:t>
       </w:r>
-      <w:hyperlink r:id="rId118">
+      <w:hyperlink r:id="rId128">
         <w:r>
           <w:rPr>
             <w:rStyle w:val="Hyperlink"/>
@@ -11439,8 +12407,8 @@
         </w:r>
       </w:hyperlink>
     </w:p>
-    <w:bookmarkEnd w:id="119"/>
-    <w:bookmarkStart w:id="121" w:name="ref-url:https://www.similarweb.com"/>
+    <w:bookmarkEnd w:id="129"/>
+    <w:bookmarkStart w:id="131" w:name="ref-url:https://www.similarweb.com"/>
     <w:p>
       <w:pPr>
         <w:pStyle w:val="Bibliography"/>
@@ -11470,7 +12438,7 @@
       <w:r>
         <w:t xml:space="preserve"> </w:t>
       </w:r>
-      <w:hyperlink r:id="rId120">
+      <w:hyperlink r:id="rId130">
         <w:r>
           <w:rPr>
             <w:rStyle w:val="Hyperlink"/>
@@ -11479,8 +12447,8 @@
         </w:r>
       </w:hyperlink>
     </w:p>
-    <w:bookmarkEnd w:id="121"/>
-    <w:bookmarkStart w:id="123" w:name="ref-url:https://pubmed.ncbi.nlm.nih.gov"/>
+    <w:bookmarkEnd w:id="131"/>
+    <w:bookmarkStart w:id="133" w:name="ref-url:https://pubmed.ncbi.nlm.nih.gov"/>
     <w:p>
       <w:pPr>
         <w:pStyle w:val="Bibliography"/>
@@ -11510,7 +12478,7 @@
       <w:r>
         <w:t xml:space="preserve"> </w:t>
       </w:r>
-      <w:hyperlink r:id="rId122">
+      <w:hyperlink r:id="rId132">
         <w:r>
           <w:rPr>
             <w:rStyle w:val="Hyperlink"/>
@@ -11519,8 +12487,8 @@
         </w:r>
       </w:hyperlink>
     </w:p>
-    <w:bookmarkEnd w:id="123"/>
-    <w:bookmarkStart w:id="125" w:name="ref-url:https://www.scopus.com"/>
+    <w:bookmarkEnd w:id="133"/>
+    <w:bookmarkStart w:id="135" w:name="ref-url:https://www.scopus.com"/>
     <w:p>
       <w:pPr>
         <w:pStyle w:val="Bibliography"/>
@@ -11534,7 +12502,7 @@
       <w:r>
         <w:t xml:space="preserve">	</w:t>
       </w:r>
-      <w:hyperlink r:id="rId124">
+      <w:hyperlink r:id="rId134">
         <w:r>
           <w:rPr>
             <w:rStyle w:val="Hyperlink"/>
@@ -11543,8 +12511,8 @@
         </w:r>
       </w:hyperlink>
     </w:p>
-    <w:bookmarkEnd w:id="125"/>
-    <w:bookmarkStart w:id="127" w:name="ref-url:https://scholar.google.com"/>
+    <w:bookmarkEnd w:id="135"/>
+    <w:bookmarkStart w:id="137" w:name="ref-url:https://scholar.google.com"/>
     <w:p>
       <w:pPr>
         <w:pStyle w:val="Bibliography"/>
@@ -11568,7 +12536,7 @@
       <w:r>
         <w:t xml:space="preserve"> </w:t>
       </w:r>
-      <w:hyperlink r:id="rId126">
+      <w:hyperlink r:id="rId136">
         <w:r>
           <w:rPr>
             <w:rStyle w:val="Hyperlink"/>
@@ -11577,8 +12545,8 @@
         </w:r>
       </w:hyperlink>
     </w:p>
-    <w:bookmarkEnd w:id="127"/>
-    <w:bookmarkStart w:id="129" w:name="ref-url:https://clarivate.com"/>
+    <w:bookmarkEnd w:id="137"/>
+    <w:bookmarkStart w:id="139" w:name="ref-url:https://clarivate.com"/>
     <w:p>
       <w:pPr>
         <w:pStyle w:val="Bibliography"/>
@@ -11608,7 +12576,7 @@
       <w:r>
         <w:t xml:space="preserve"> </w:t>
       </w:r>
-      <w:hyperlink r:id="rId128">
+      <w:hyperlink r:id="rId138">
         <w:r>
           <w:rPr>
             <w:rStyle w:val="Hyperlink"/>
@@ -11617,8 +12585,8 @@
         </w:r>
       </w:hyperlink>
     </w:p>
-    <w:bookmarkEnd w:id="129"/>
-    <w:bookmarkStart w:id="131" w:name="ref-url:https://openalex.org"/>
+    <w:bookmarkEnd w:id="139"/>
+    <w:bookmarkStart w:id="141" w:name="ref-url:https://openalex.org"/>
     <w:p>
       <w:pPr>
         <w:pStyle w:val="Bibliography"/>
@@ -11642,7 +12610,7 @@
       <w:r>
         <w:t xml:space="preserve"> </w:t>
       </w:r>
-      <w:hyperlink r:id="rId130">
+      <w:hyperlink r:id="rId140">
         <w:r>
           <w:rPr>
             <w:rStyle w:val="Hyperlink"/>
@@ -11651,8 +12619,8 @@
         </w:r>
       </w:hyperlink>
     </w:p>
-    <w:bookmarkEnd w:id="131"/>
-    <w:bookmarkStart w:id="136" w:name="ref-doi:10.1371/journal.pone.0311493"/>
+    <w:bookmarkEnd w:id="141"/>
+    <w:bookmarkStart w:id="146" w:name="ref-doi:10.1371/journal.pone.0311493"/>
     <w:p>
       <w:pPr>
         <w:pStyle w:val="Bibliography"/>
@@ -11698,7 +12666,7 @@
       <w:r>
         <w:t xml:space="preserve"> </w:t>
       </w:r>
-      <w:hyperlink r:id="rId132">
+      <w:hyperlink r:id="rId142">
         <w:r>
           <w:rPr>
             <w:rStyle w:val="Hyperlink"/>
@@ -11715,7 +12683,7 @@
       <w:r>
         <w:t xml:space="preserve"> </w:t>
       </w:r>
-      <w:hyperlink r:id="rId133">
+      <w:hyperlink r:id="rId143">
         <w:r>
           <w:rPr>
             <w:rStyle w:val="Hyperlink"/>
@@ -11732,7 +12700,7 @@
       <w:r>
         <w:t xml:space="preserve"> </w:t>
       </w:r>
-      <w:hyperlink r:id="rId134">
+      <w:hyperlink r:id="rId144">
         <w:r>
           <w:rPr>
             <w:rStyle w:val="Hyperlink"/>
@@ -11749,7 +12717,7 @@
       <w:r>
         <w:t xml:space="preserve"> </w:t>
       </w:r>
-      <w:hyperlink r:id="rId135">
+      <w:hyperlink r:id="rId145">
         <w:r>
           <w:rPr>
             <w:rStyle w:val="Hyperlink"/>
@@ -11758,8 +12726,8 @@
         </w:r>
       </w:hyperlink>
     </w:p>
-    <w:bookmarkEnd w:id="136"/>
-    <w:bookmarkStart w:id="140" w:name="ref-doi:10.1038/520429a"/>
+    <w:bookmarkEnd w:id="146"/>
+    <w:bookmarkStart w:id="150" w:name="ref-doi:10.1038/520429a"/>
     <w:p>
       <w:pPr>
         <w:pStyle w:val="Bibliography"/>
@@ -11805,7 +12773,7 @@
       <w:r>
         <w:t xml:space="preserve"> </w:t>
       </w:r>
-      <w:hyperlink r:id="rId137">
+      <w:hyperlink r:id="rId147">
         <w:r>
           <w:rPr>
             <w:rStyle w:val="Hyperlink"/>
@@ -11822,7 +12790,7 @@
       <w:r>
         <w:t xml:space="preserve"> </w:t>
       </w:r>
-      <w:hyperlink r:id="rId138">
+      <w:hyperlink r:id="rId148">
         <w:r>
           <w:rPr>
             <w:rStyle w:val="Hyperlink"/>
@@ -11839,7 +12807,7 @@
       <w:r>
         <w:t xml:space="preserve"> </w:t>
       </w:r>
-      <w:hyperlink r:id="rId139">
+      <w:hyperlink r:id="rId149">
         <w:r>
           <w:rPr>
             <w:rStyle w:val="Hyperlink"/>
@@ -11848,8 +12816,8 @@
         </w:r>
       </w:hyperlink>
     </w:p>
-    <w:bookmarkEnd w:id="140"/>
-    <w:bookmarkStart w:id="144" w:name="ref-doi:10.4103/1008-682X.171582"/>
+    <w:bookmarkEnd w:id="150"/>
+    <w:bookmarkStart w:id="154" w:name="ref-doi:10.4103/1008-682X.171582"/>
     <w:p>
       <w:pPr>
         <w:pStyle w:val="Bibliography"/>
@@ -11895,7 +12863,7 @@
       <w:r>
         <w:t xml:space="preserve"> </w:t>
       </w:r>
-      <w:hyperlink r:id="rId141">
+      <w:hyperlink r:id="rId151">
         <w:r>
           <w:rPr>
             <w:rStyle w:val="Hyperlink"/>
@@ -11912,7 +12880,7 @@
       <w:r>
         <w:t xml:space="preserve"> </w:t>
       </w:r>
-      <w:hyperlink r:id="rId142">
+      <w:hyperlink r:id="rId152">
         <w:r>
           <w:rPr>
             <w:rStyle w:val="Hyperlink"/>
@@ -11929,7 +12897,7 @@
       <w:r>
         <w:t xml:space="preserve"> </w:t>
       </w:r>
-      <w:hyperlink r:id="rId143">
+      <w:hyperlink r:id="rId153">
         <w:r>
           <w:rPr>
             <w:rStyle w:val="Hyperlink"/>
@@ -11938,8 +12906,8 @@
         </w:r>
       </w:hyperlink>
     </w:p>
-    <w:bookmarkEnd w:id="144"/>
-    <w:bookmarkStart w:id="149" w:name="ref-doi:10.1101/2023.09.12.557386"/>
+    <w:bookmarkEnd w:id="154"/>
+    <w:bookmarkStart w:id="159" w:name="ref-doi:10.1101/2023.09.12.557386"/>
     <w:p>
       <w:pPr>
         <w:pStyle w:val="Bibliography"/>
@@ -11985,7 +12953,7 @@
       <w:r>
         <w:t xml:space="preserve"> </w:t>
       </w:r>
-      <w:hyperlink r:id="rId145">
+      <w:hyperlink r:id="rId155">
         <w:r>
           <w:rPr>
             <w:rStyle w:val="Hyperlink"/>
@@ -12002,7 +12970,7 @@
       <w:r>
         <w:t xml:space="preserve"> </w:t>
       </w:r>
-      <w:hyperlink r:id="rId146">
+      <w:hyperlink r:id="rId156">
         <w:r>
           <w:rPr>
             <w:rStyle w:val="Hyperlink"/>
@@ -12019,7 +12987,7 @@
       <w:r>
         <w:t xml:space="preserve"> </w:t>
       </w:r>
-      <w:hyperlink r:id="rId147">
+      <w:hyperlink r:id="rId157">
         <w:r>
           <w:rPr>
             <w:rStyle w:val="Hyperlink"/>
@@ -12036,7 +13004,7 @@
       <w:r>
         <w:t xml:space="preserve"> </w:t>
       </w:r>
-      <w:hyperlink r:id="rId148">
+      <w:hyperlink r:id="rId158">
         <w:r>
           <w:rPr>
             <w:rStyle w:val="Hyperlink"/>
@@ -12045,8 +13013,8 @@
         </w:r>
       </w:hyperlink>
     </w:p>
-    <w:bookmarkEnd w:id="149"/>
-    <w:bookmarkStart w:id="154" w:name="ref-doi:10.2196/63544"/>
+    <w:bookmarkEnd w:id="159"/>
+    <w:bookmarkStart w:id="164" w:name="ref-doi:10.2196/63544"/>
     <w:p>
       <w:pPr>
         <w:pStyle w:val="Bibliography"/>
@@ -12092,7 +13060,7 @@
       <w:r>
         <w:t xml:space="preserve"> </w:t>
       </w:r>
-      <w:hyperlink r:id="rId150">
+      <w:hyperlink r:id="rId160">
         <w:r>
           <w:rPr>
             <w:rStyle w:val="Hyperlink"/>
@@ -12109,7 +13077,7 @@
       <w:r>
         <w:t xml:space="preserve"> </w:t>
       </w:r>
-      <w:hyperlink r:id="rId151">
+      <w:hyperlink r:id="rId161">
         <w:r>
           <w:rPr>
             <w:rStyle w:val="Hyperlink"/>
@@ -12126,7 +13094,7 @@
       <w:r>
         <w:t xml:space="preserve"> </w:t>
       </w:r>
-      <w:hyperlink r:id="rId152">
+      <w:hyperlink r:id="rId162">
         <w:r>
           <w:rPr>
             <w:rStyle w:val="Hyperlink"/>
@@ -12143,7 +13111,7 @@
       <w:r>
         <w:t xml:space="preserve"> </w:t>
       </w:r>
-      <w:hyperlink r:id="rId153">
+      <w:hyperlink r:id="rId163">
         <w:r>
           <w:rPr>
             <w:rStyle w:val="Hyperlink"/>
@@ -12152,8 +13120,8 @@
         </w:r>
       </w:hyperlink>
     </w:p>
-    <w:bookmarkEnd w:id="154"/>
-    <w:bookmarkStart w:id="158" w:name="ref-doi:10.15265/IY-2014-0020"/>
+    <w:bookmarkEnd w:id="164"/>
+    <w:bookmarkStart w:id="168" w:name="ref-doi:10.15265/IY-2014-0020"/>
     <w:p>
       <w:pPr>
         <w:pStyle w:val="Bibliography"/>
@@ -12199,7 +13167,7 @@
       <w:r>
         <w:t xml:space="preserve"> </w:t>
       </w:r>
-      <w:hyperlink r:id="rId155">
+      <w:hyperlink r:id="rId165">
         <w:r>
           <w:rPr>
             <w:rStyle w:val="Hyperlink"/>
@@ -12216,7 +13184,7 @@
       <w:r>
         <w:t xml:space="preserve"> </w:t>
       </w:r>
-      <w:hyperlink r:id="rId156">
+      <w:hyperlink r:id="rId166">
         <w:r>
           <w:rPr>
             <w:rStyle w:val="Hyperlink"/>
@@ -12233,7 +13201,7 @@
       <w:r>
         <w:t xml:space="preserve"> </w:t>
       </w:r>
-      <w:hyperlink r:id="rId157">
+      <w:hyperlink r:id="rId167">
         <w:r>
           <w:rPr>
             <w:rStyle w:val="Hyperlink"/>
@@ -12242,8 +13210,8 @@
         </w:r>
       </w:hyperlink>
     </w:p>
-    <w:bookmarkEnd w:id="158"/>
-    <w:bookmarkStart w:id="163" w:name="ref-doi:10.1371/journal.pone.0229003"/>
+    <w:bookmarkEnd w:id="168"/>
+    <w:bookmarkStart w:id="173" w:name="ref-doi:10.1371/journal.pone.0229003"/>
     <w:p>
       <w:pPr>
         <w:pStyle w:val="Bibliography"/>
@@ -12289,7 +13257,7 @@
       <w:r>
         <w:t xml:space="preserve"> </w:t>
       </w:r>
-      <w:hyperlink r:id="rId159">
+      <w:hyperlink r:id="rId169">
         <w:r>
           <w:rPr>
             <w:rStyle w:val="Hyperlink"/>
@@ -12306,7 +13274,7 @@
       <w:r>
         <w:t xml:space="preserve"> </w:t>
       </w:r>
-      <w:hyperlink r:id="rId160">
+      <w:hyperlink r:id="rId170">
         <w:r>
           <w:rPr>
             <w:rStyle w:val="Hyperlink"/>
@@ -12323,7 +13291,7 @@
       <w:r>
         <w:t xml:space="preserve"> </w:t>
       </w:r>
-      <w:hyperlink r:id="rId161">
+      <w:hyperlink r:id="rId171">
         <w:r>
           <w:rPr>
             <w:rStyle w:val="Hyperlink"/>
@@ -12340,7 +13308,7 @@
       <w:r>
         <w:t xml:space="preserve"> </w:t>
       </w:r>
-      <w:hyperlink r:id="rId162">
+      <w:hyperlink r:id="rId172">
         <w:r>
           <w:rPr>
             <w:rStyle w:val="Hyperlink"/>
@@ -12349,8 +13317,8 @@
         </w:r>
       </w:hyperlink>
     </w:p>
-    <w:bookmarkEnd w:id="163"/>
-    <w:bookmarkStart w:id="168" w:name="ref-doi:10.15585/mmwr.su7303a1"/>
+    <w:bookmarkEnd w:id="173"/>
+    <w:bookmarkStart w:id="178" w:name="ref-doi:10.15585/mmwr.su7303a1"/>
     <w:p>
       <w:pPr>
         <w:pStyle w:val="Bibliography"/>
@@ -12396,7 +13364,7 @@
       <w:r>
         <w:t xml:space="preserve"> </w:t>
       </w:r>
-      <w:hyperlink r:id="rId164">
+      <w:hyperlink r:id="rId174">
         <w:r>
           <w:rPr>
             <w:rStyle w:val="Hyperlink"/>
@@ -12413,7 +13381,7 @@
       <w:r>
         <w:t xml:space="preserve"> </w:t>
       </w:r>
-      <w:hyperlink r:id="rId165">
+      <w:hyperlink r:id="rId175">
         <w:r>
           <w:rPr>
             <w:rStyle w:val="Hyperlink"/>
@@ -12430,7 +13398,7 @@
       <w:r>
         <w:t xml:space="preserve"> </w:t>
       </w:r>
-      <w:hyperlink r:id="rId166">
+      <w:hyperlink r:id="rId176">
         <w:r>
           <w:rPr>
             <w:rStyle w:val="Hyperlink"/>
@@ -12447,7 +13415,7 @@
       <w:r>
         <w:t xml:space="preserve"> </w:t>
       </w:r>
-      <w:hyperlink r:id="rId167">
+      <w:hyperlink r:id="rId177">
         <w:r>
           <w:rPr>
             <w:rStyle w:val="Hyperlink"/>
@@ -12456,8 +13424,8 @@
         </w:r>
       </w:hyperlink>
     </w:p>
-    <w:bookmarkEnd w:id="168"/>
-    <w:bookmarkStart w:id="173" w:name="ref-doi:10.1038/nbt.3780"/>
+    <w:bookmarkEnd w:id="178"/>
+    <w:bookmarkStart w:id="183" w:name="ref-doi:10.1038/nbt.3780"/>
     <w:p>
       <w:pPr>
         <w:pStyle w:val="Bibliography"/>
@@ -12503,7 +13471,7 @@
       <w:r>
         <w:t xml:space="preserve"> </w:t>
       </w:r>
-      <w:hyperlink r:id="rId169">
+      <w:hyperlink r:id="rId179">
         <w:r>
           <w:rPr>
             <w:rStyle w:val="Hyperlink"/>
@@ -12520,7 +13488,7 @@
       <w:r>
         <w:t xml:space="preserve"> </w:t>
       </w:r>
-      <w:hyperlink r:id="rId170">
+      <w:hyperlink r:id="rId180">
         <w:r>
           <w:rPr>
             <w:rStyle w:val="Hyperlink"/>
@@ -12537,7 +13505,7 @@
       <w:r>
         <w:t xml:space="preserve"> </w:t>
       </w:r>
-      <w:hyperlink r:id="rId171">
+      <w:hyperlink r:id="rId181">
         <w:r>
           <w:rPr>
             <w:rStyle w:val="Hyperlink"/>
@@ -12554,7 +13522,7 @@
       <w:r>
         <w:t xml:space="preserve"> </w:t>
       </w:r>
-      <w:hyperlink r:id="rId172">
+      <w:hyperlink r:id="rId182">
         <w:r>
           <w:rPr>
             <w:rStyle w:val="Hyperlink"/>
@@ -12563,8 +13531,8 @@
         </w:r>
       </w:hyperlink>
     </w:p>
-    <w:bookmarkEnd w:id="173"/>
-    <w:bookmarkStart w:id="178" w:name="ref-doi:10.1186/gb-2004-5-10-r80"/>
+    <w:bookmarkEnd w:id="183"/>
+    <w:bookmarkStart w:id="188" w:name="ref-doi:10.1186/gb-2004-5-10-r80"/>
     <w:p>
       <w:pPr>
         <w:pStyle w:val="Bibliography"/>
@@ -12610,7 +13578,7 @@
       <w:r>
         <w:t xml:space="preserve"> </w:t>
       </w:r>
-      <w:hyperlink r:id="rId174">
+      <w:hyperlink r:id="rId184">
         <w:r>
           <w:rPr>
             <w:rStyle w:val="Hyperlink"/>
@@ -12627,7 +13595,7 @@
       <w:r>
         <w:t xml:space="preserve"> </w:t>
       </w:r>
-      <w:hyperlink r:id="rId175">
+      <w:hyperlink r:id="rId185">
         <w:r>
           <w:rPr>
             <w:rStyle w:val="Hyperlink"/>
@@ -12644,7 +13612,7 @@
       <w:r>
         <w:t xml:space="preserve"> </w:t>
       </w:r>
-      <w:hyperlink r:id="rId176">
+      <w:hyperlink r:id="rId186">
         <w:r>
           <w:rPr>
             <w:rStyle w:val="Hyperlink"/>
@@ -12661,7 +13629,7 @@
       <w:r>
         <w:t xml:space="preserve"> </w:t>
       </w:r>
-      <w:hyperlink r:id="rId177">
+      <w:hyperlink r:id="rId187">
         <w:r>
           <w:rPr>
             <w:rStyle w:val="Hyperlink"/>
@@ -12670,8 +13638,8 @@
         </w:r>
       </w:hyperlink>
     </w:p>
-    <w:bookmarkEnd w:id="178"/>
-    <w:bookmarkStart w:id="183" w:name="ref-doi:10.12688/f1000research.9206.1"/>
+    <w:bookmarkEnd w:id="188"/>
+    <w:bookmarkStart w:id="193" w:name="ref-doi:10.12688/f1000research.9206.1"/>
     <w:p>
       <w:pPr>
         <w:pStyle w:val="Bibliography"/>
@@ -12717,7 +13685,7 @@
       <w:r>
         <w:t xml:space="preserve"> </w:t>
       </w:r>
-      <w:hyperlink r:id="rId179">
+      <w:hyperlink r:id="rId189">
         <w:r>
           <w:rPr>
             <w:rStyle w:val="Hyperlink"/>
@@ -12734,7 +13702,7 @@
       <w:r>
         <w:t xml:space="preserve"> </w:t>
       </w:r>
-      <w:hyperlink r:id="rId180">
+      <w:hyperlink r:id="rId190">
         <w:r>
           <w:rPr>
             <w:rStyle w:val="Hyperlink"/>
@@ -12751,7 +13719,7 @@
       <w:r>
         <w:t xml:space="preserve"> </w:t>
       </w:r>
-      <w:hyperlink r:id="rId181">
+      <w:hyperlink r:id="rId191">
         <w:r>
           <w:rPr>
             <w:rStyle w:val="Hyperlink"/>
@@ -12768,7 +13736,7 @@
       <w:r>
         <w:t xml:space="preserve"> </w:t>
       </w:r>
-      <w:hyperlink r:id="rId182">
+      <w:hyperlink r:id="rId192">
         <w:r>
           <w:rPr>
             <w:rStyle w:val="Hyperlink"/>
@@ -12777,8 +13745,8 @@
         </w:r>
       </w:hyperlink>
     </w:p>
-    <w:bookmarkEnd w:id="183"/>
-    <w:bookmarkStart w:id="185" w:name="X2b10f9b9a4270be0d96aba4cc529b1548cdbabe"/>
+    <w:bookmarkEnd w:id="193"/>
+    <w:bookmarkStart w:id="195" w:name="X2b10f9b9a4270be0d96aba4cc529b1548cdbabe"/>
     <w:p>
       <w:pPr>
         <w:pStyle w:val="Bibliography"/>
@@ -12808,7 +13776,7 @@
       <w:r>
         <w:t xml:space="preserve"> </w:t>
       </w:r>
-      <w:hyperlink r:id="rId184">
+      <w:hyperlink r:id="rId194">
         <w:r>
           <w:rPr>
             <w:rStyle w:val="Hyperlink"/>
@@ -12817,8 +13785,8 @@
         </w:r>
       </w:hyperlink>
     </w:p>
-    <w:bookmarkEnd w:id="185"/>
-    <w:bookmarkStart w:id="187" w:name="X7ad42e4ba87689c7356ff47da0c3a62acb6be13"/>
+    <w:bookmarkEnd w:id="195"/>
+    <w:bookmarkStart w:id="197" w:name="X7ad42e4ba87689c7356ff47da0c3a62acb6be13"/>
     <w:p>
       <w:pPr>
         <w:pStyle w:val="Bibliography"/>
@@ -12864,7 +13832,7 @@
       <w:r>
         <w:t xml:space="preserve"> </w:t>
       </w:r>
-      <w:hyperlink r:id="rId186">
+      <w:hyperlink r:id="rId196">
         <w:r>
           <w:rPr>
             <w:rStyle w:val="Hyperlink"/>
@@ -12873,8 +13841,8 @@
         </w:r>
       </w:hyperlink>
     </w:p>
-    <w:bookmarkEnd w:id="187"/>
-    <w:bookmarkStart w:id="192" w:name="ref-doi:10.1093/jamia/ocab278"/>
+    <w:bookmarkEnd w:id="197"/>
+    <w:bookmarkStart w:id="202" w:name="ref-doi:10.1093/jamia/ocab278"/>
     <w:p>
       <w:pPr>
         <w:pStyle w:val="Bibliography"/>
@@ -12920,7 +13888,7 @@
       <w:r>
         <w:t xml:space="preserve"> </w:t>
       </w:r>
-      <w:hyperlink r:id="rId188">
+      <w:hyperlink r:id="rId198">
         <w:r>
           <w:rPr>
             <w:rStyle w:val="Hyperlink"/>
@@ -12937,7 +13905,7 @@
       <w:r>
         <w:t xml:space="preserve"> </w:t>
       </w:r>
-      <w:hyperlink r:id="rId189">
+      <w:hyperlink r:id="rId199">
         <w:r>
           <w:rPr>
             <w:rStyle w:val="Hyperlink"/>
@@ -12954,7 +13922,7 @@
       <w:r>
         <w:t xml:space="preserve"> </w:t>
       </w:r>
-      <w:hyperlink r:id="rId190">
+      <w:hyperlink r:id="rId200">
         <w:r>
           <w:rPr>
             <w:rStyle w:val="Hyperlink"/>
@@ -12971,7 +13939,7 @@
       <w:r>
         <w:t xml:space="preserve"> </w:t>
       </w:r>
-      <w:hyperlink r:id="rId191">
+      <w:hyperlink r:id="rId201">
         <w:r>
           <w:rPr>
             <w:rStyle w:val="Hyperlink"/>
@@ -12980,8 +13948,8 @@
         </w:r>
       </w:hyperlink>
     </w:p>
-    <w:bookmarkEnd w:id="192"/>
-    <w:bookmarkStart w:id="194" w:name="ref-url:https://orcid.org"/>
+    <w:bookmarkEnd w:id="202"/>
+    <w:bookmarkStart w:id="204" w:name="ref-url:https://orcid.org"/>
     <w:p>
       <w:pPr>
         <w:pStyle w:val="Bibliography"/>
@@ -13005,7 +13973,7 @@
       <w:r>
         <w:t xml:space="preserve"> </w:t>
       </w:r>
-      <w:hyperlink r:id="rId193">
+      <w:hyperlink r:id="rId203">
         <w:r>
           <w:rPr>
             <w:rStyle w:val="Hyperlink"/>
@@ -13014,8 +13982,8 @@
         </w:r>
       </w:hyperlink>
     </w:p>
-    <w:bookmarkEnd w:id="194"/>
-    <w:bookmarkStart w:id="197" w:name="ref-doi:10.48550/arXiv.2509.12709"/>
+    <w:bookmarkEnd w:id="204"/>
+    <w:bookmarkStart w:id="207" w:name="ref-doi:10.48550/arXiv.2509.12709"/>
     <w:p>
       <w:pPr>
         <w:pStyle w:val="Bibliography"/>
@@ -13061,7 +14029,7 @@
       <w:r>
         <w:t xml:space="preserve"> </w:t>
       </w:r>
-      <w:hyperlink r:id="rId195">
+      <w:hyperlink r:id="rId205">
         <w:r>
           <w:rPr>
             <w:rStyle w:val="Hyperlink"/>
@@ -13078,7 +14046,7 @@
       <w:r>
         <w:t xml:space="preserve"> </w:t>
       </w:r>
-      <w:hyperlink r:id="rId196">
+      <w:hyperlink r:id="rId206">
         <w:r>
           <w:rPr>
             <w:rStyle w:val="Hyperlink"/>
@@ -13087,8 +14055,8 @@
         </w:r>
       </w:hyperlink>
     </w:p>
-    <w:bookmarkEnd w:id="197"/>
-    <w:bookmarkStart w:id="199" w:name="Xc1554ee4988a5c64dd2a8bc05a8ce444d54a496"/>
+    <w:bookmarkEnd w:id="207"/>
+    <w:bookmarkStart w:id="209" w:name="Xc1554ee4988a5c64dd2a8bc05a8ce444d54a496"/>
     <w:p>
       <w:pPr>
         <w:pStyle w:val="Bibliography"/>
@@ -13112,7 +14080,7 @@
       <w:r>
         <w:t xml:space="preserve"> </w:t>
       </w:r>
-      <w:hyperlink r:id="rId198">
+      <w:hyperlink r:id="rId208">
         <w:r>
           <w:rPr>
             <w:rStyle w:val="Hyperlink"/>
@@ -13121,8 +14089,8 @@
         </w:r>
       </w:hyperlink>
     </w:p>
-    <w:bookmarkEnd w:id="199"/>
-    <w:bookmarkStart w:id="204" w:name="ref-doi:10.1007/s10488-013-0528-y"/>
+    <w:bookmarkEnd w:id="209"/>
+    <w:bookmarkStart w:id="214" w:name="ref-doi:10.1007/s10488-013-0528-y"/>
     <w:p>
       <w:pPr>
         <w:pStyle w:val="Bibliography"/>
@@ -13168,7 +14136,7 @@
       <w:r>
         <w:t xml:space="preserve"> </w:t>
       </w:r>
-      <w:hyperlink r:id="rId200">
+      <w:hyperlink r:id="rId210">
         <w:r>
           <w:rPr>
             <w:rStyle w:val="Hyperlink"/>
@@ -13185,7 +14153,7 @@
       <w:r>
         <w:t xml:space="preserve"> </w:t>
       </w:r>
-      <w:hyperlink r:id="rId201">
+      <w:hyperlink r:id="rId211">
         <w:r>
           <w:rPr>
             <w:rStyle w:val="Hyperlink"/>
@@ -13202,7 +14170,7 @@
       <w:r>
         <w:t xml:space="preserve"> </w:t>
       </w:r>
-      <w:hyperlink r:id="rId202">
+      <w:hyperlink r:id="rId212">
         <w:r>
           <w:rPr>
             <w:rStyle w:val="Hyperlink"/>
@@ -13219,7 +14187,7 @@
       <w:r>
         <w:t xml:space="preserve"> </w:t>
       </w:r>
-      <w:hyperlink r:id="rId203">
+      <w:hyperlink r:id="rId213">
         <w:r>
           <w:rPr>
             <w:rStyle w:val="Hyperlink"/>
@@ -13228,8 +14196,8 @@
         </w:r>
       </w:hyperlink>
     </w:p>
-    <w:bookmarkEnd w:id="204"/>
-    <w:bookmarkStart w:id="209" w:name="ref-doi:10.1002/jgf2.736"/>
+    <w:bookmarkEnd w:id="214"/>
+    <w:bookmarkStart w:id="219" w:name="ref-doi:10.1002/jgf2.736"/>
     <w:p>
       <w:pPr>
         <w:pStyle w:val="Bibliography"/>
@@ -13275,7 +14243,7 @@
       <w:r>
         <w:t xml:space="preserve"> </w:t>
       </w:r>
-      <w:hyperlink r:id="rId205">
+      <w:hyperlink r:id="rId215">
         <w:r>
           <w:rPr>
             <w:rStyle w:val="Hyperlink"/>
@@ -13292,7 +14260,7 @@
       <w:r>
         <w:t xml:space="preserve"> </w:t>
       </w:r>
-      <w:hyperlink r:id="rId206">
+      <w:hyperlink r:id="rId216">
         <w:r>
           <w:rPr>
             <w:rStyle w:val="Hyperlink"/>
@@ -13309,7 +14277,7 @@
       <w:r>
         <w:t xml:space="preserve"> </w:t>
       </w:r>
-      <w:hyperlink r:id="rId207">
+      <w:hyperlink r:id="rId217">
         <w:r>
           <w:rPr>
             <w:rStyle w:val="Hyperlink"/>
@@ -13326,7 +14294,7 @@
       <w:r>
         <w:t xml:space="preserve"> </w:t>
       </w:r>
-      <w:hyperlink r:id="rId208">
+      <w:hyperlink r:id="rId218">
         <w:r>
           <w:rPr>
             <w:rStyle w:val="Hyperlink"/>
@@ -13335,8 +14303,8 @@
         </w:r>
       </w:hyperlink>
     </w:p>
-    <w:bookmarkEnd w:id="209"/>
-    <w:bookmarkStart w:id="211" w:name="X76ee81cf61288aec0f48b9d17d5a06038eee18d"/>
+    <w:bookmarkEnd w:id="219"/>
+    <w:bookmarkStart w:id="221" w:name="X76ee81cf61288aec0f48b9d17d5a06038eee18d"/>
     <w:p>
       <w:pPr>
         <w:pStyle w:val="Bibliography"/>
@@ -13350,7 +14318,7 @@
       <w:r>
         <w:t xml:space="preserve">	</w:t>
       </w:r>
-      <w:hyperlink r:id="rId210">
+      <w:hyperlink r:id="rId220">
         <w:r>
           <w:rPr>
             <w:rStyle w:val="Hyperlink"/>
@@ -13359,8 +14327,8 @@
         </w:r>
       </w:hyperlink>
     </w:p>
-    <w:bookmarkEnd w:id="211"/>
-    <w:bookmarkStart w:id="214" w:name="ref-pmid:30861395"/>
+    <w:bookmarkEnd w:id="221"/>
+    <w:bookmarkStart w:id="224" w:name="ref-pmid:30861395"/>
     <w:p>
       <w:pPr>
         <w:pStyle w:val="Bibliography"/>
@@ -13406,7 +14374,7 @@
       <w:r>
         <w:t xml:space="preserve"> </w:t>
       </w:r>
-      <w:hyperlink r:id="rId212">
+      <w:hyperlink r:id="rId222">
         <w:r>
           <w:rPr>
             <w:rStyle w:val="Hyperlink"/>
@@ -13423,7 +14391,7 @@
       <w:r>
         <w:t xml:space="preserve"> </w:t>
       </w:r>
-      <w:hyperlink r:id="rId213">
+      <w:hyperlink r:id="rId223">
         <w:r>
           <w:rPr>
             <w:rStyle w:val="Hyperlink"/>
@@ -13440,7 +14408,7 @@
       <w:r>
         <w:t xml:space="preserve"> </w:t>
       </w:r>
-      <w:hyperlink r:id="rId212">
+      <w:hyperlink r:id="rId222">
         <w:r>
           <w:rPr>
             <w:rStyle w:val="Hyperlink"/>
@@ -13449,8 +14417,8 @@
         </w:r>
       </w:hyperlink>
     </w:p>
-    <w:bookmarkEnd w:id="214"/>
-    <w:bookmarkStart w:id="219" w:name="ref-doi:10.1016/j.socscimed.2017.03.041"/>
+    <w:bookmarkEnd w:id="224"/>
+    <w:bookmarkStart w:id="229" w:name="ref-doi:10.1016/j.socscimed.2017.03.041"/>
     <w:p>
       <w:pPr>
         <w:pStyle w:val="Bibliography"/>
@@ -13496,7 +14464,7 @@
       <w:r>
         <w:t xml:space="preserve"> </w:t>
       </w:r>
-      <w:hyperlink r:id="rId215">
+      <w:hyperlink r:id="rId225">
         <w:r>
           <w:rPr>
             <w:rStyle w:val="Hyperlink"/>
@@ -13513,7 +14481,7 @@
       <w:r>
         <w:t xml:space="preserve"> </w:t>
       </w:r>
-      <w:hyperlink r:id="rId216">
+      <w:hyperlink r:id="rId226">
         <w:r>
           <w:rPr>
             <w:rStyle w:val="Hyperlink"/>
@@ -13530,7 +14498,7 @@
       <w:r>
         <w:t xml:space="preserve"> </w:t>
       </w:r>
-      <w:hyperlink r:id="rId217">
+      <w:hyperlink r:id="rId227">
         <w:r>
           <w:rPr>
             <w:rStyle w:val="Hyperlink"/>
@@ -13547,7 +14515,7 @@
       <w:r>
         <w:t xml:space="preserve"> </w:t>
       </w:r>
-      <w:hyperlink r:id="rId218">
+      <w:hyperlink r:id="rId228">
         <w:r>
           <w:rPr>
             <w:rStyle w:val="Hyperlink"/>
@@ -13556,8 +14524,8 @@
         </w:r>
       </w:hyperlink>
     </w:p>
-    <w:bookmarkEnd w:id="219"/>
-    <w:bookmarkStart w:id="221" w:name="X95f22a201431050b3e5367321fb4ecc35cbc91c"/>
+    <w:bookmarkEnd w:id="229"/>
+    <w:bookmarkStart w:id="231" w:name="X95f22a201431050b3e5367321fb4ecc35cbc91c"/>
     <w:p>
       <w:pPr>
         <w:pStyle w:val="Bibliography"/>
@@ -13581,7 +14549,7 @@
       <w:r>
         <w:t xml:space="preserve"> </w:t>
       </w:r>
-      <w:hyperlink r:id="rId220">
+      <w:hyperlink r:id="rId230">
         <w:r>
           <w:rPr>
             <w:rStyle w:val="Hyperlink"/>
@@ -13590,8 +14558,8 @@
         </w:r>
       </w:hyperlink>
     </w:p>
-    <w:bookmarkEnd w:id="221"/>
-    <w:bookmarkStart w:id="223" w:name="X999055200295ead81fddf881b6ef724ff612aa1"/>
+    <w:bookmarkEnd w:id="231"/>
+    <w:bookmarkStart w:id="233" w:name="X999055200295ead81fddf881b6ef724ff612aa1"/>
     <w:p>
       <w:pPr>
         <w:pStyle w:val="Bibliography"/>
@@ -13615,7 +14583,7 @@
       <w:r>
         <w:t xml:space="preserve"> </w:t>
       </w:r>
-      <w:hyperlink r:id="rId222">
+      <w:hyperlink r:id="rId232">
         <w:r>
           <w:rPr>
             <w:rStyle w:val="Hyperlink"/>
@@ -13624,9 +14592,9 @@
         </w:r>
       </w:hyperlink>
     </w:p>
-    <w:bookmarkEnd w:id="223"/>
-    <w:bookmarkEnd w:id="224"/>
-    <w:bookmarkEnd w:id="225"/>
+    <w:bookmarkEnd w:id="233"/>
+    <w:bookmarkEnd w:id="234"/>
+    <w:bookmarkEnd w:id="235"/>
     <w:sectPr>
       <w:footnotePr>
         <w:numRestart w:val="eachSect"/>
@@ -13737,8 +14705,232 @@
       </w:pPr>
     </w:lvl>
   </w:abstractNum>
+  <w:abstractNum w:abstractNumId="991">
+    <w:nsid w:val="0000A991"/>
+    <w:multiLevelType w:val="multilevel"/>
+    <w:lvl w:ilvl="0">
+      <w:numFmt w:val="bullet"/>
+      <w:lvlText w:val=""/>
+      <w:lvlJc w:val="left"/>
+      <w:pPr>
+        <w:ind w:left="720" w:hanging="360"/>
+      </w:pPr>
+      <w:rPr>
+        <w:rFonts w:ascii="Symbol" w:hAnsi="Symbol" w:cs="Symbol" w:hint="default"/>
+      </w:rPr>
+    </w:lvl>
+    <w:lvl w:ilvl="1">
+      <w:numFmt w:val="bullet"/>
+      <w:lvlText w:val="o"/>
+      <w:lvlJc w:val="left"/>
+      <w:pPr>
+        <w:ind w:left="1440" w:hanging="360"/>
+      </w:pPr>
+      <w:rPr>
+        <w:rFonts w:ascii="Courier New" w:hAnsi="Courier New" w:cs="Courier New" w:hint="default"/>
+      </w:rPr>
+    </w:lvl>
+    <w:lvl w:ilvl="2">
+      <w:numFmt w:val="bullet"/>
+      <w:lvlText w:val=""/>
+      <w:lvlJc w:val="left"/>
+      <w:pPr>
+        <w:ind w:left="2160" w:hanging="360"/>
+      </w:pPr>
+      <w:rPr>
+        <w:rFonts w:ascii="Wingdings" w:hAnsi="Wingdings" w:cs="Wingdings" w:hint="default"/>
+      </w:rPr>
+    </w:lvl>
+    <w:lvl w:ilvl="3">
+      <w:numFmt w:val="bullet"/>
+      <w:lvlText w:val=""/>
+      <w:lvlJc w:val="left"/>
+      <w:pPr>
+        <w:ind w:left="2880" w:hanging="360"/>
+      </w:pPr>
+      <w:rPr>
+        <w:rFonts w:ascii="Symbol" w:hAnsi="Symbol" w:cs="Symbol" w:hint="default"/>
+      </w:rPr>
+    </w:lvl>
+    <w:lvl w:ilvl="4">
+      <w:numFmt w:val="bullet"/>
+      <w:lvlText w:val="o"/>
+      <w:lvlJc w:val="left"/>
+      <w:pPr>
+        <w:ind w:left="3600" w:hanging="360"/>
+      </w:pPr>
+      <w:rPr>
+        <w:rFonts w:ascii="Courier New" w:hAnsi="Courier New" w:cs="Courier New" w:hint="default"/>
+      </w:rPr>
+    </w:lvl>
+    <w:lvl w:ilvl="5">
+      <w:numFmt w:val="bullet"/>
+      <w:lvlText w:val=""/>
+      <w:lvlJc w:val="left"/>
+      <w:pPr>
+        <w:ind w:left="4320" w:hanging="360"/>
+      </w:pPr>
+      <w:rPr>
+        <w:rFonts w:ascii="Wingdings" w:hAnsi="Wingdings" w:cs="Wingdings" w:hint="default"/>
+      </w:rPr>
+    </w:lvl>
+    <w:lvl w:ilvl="6">
+      <w:numFmt w:val="bullet"/>
+      <w:lvlText w:val=""/>
+      <w:lvlJc w:val="left"/>
+      <w:pPr>
+        <w:ind w:left="5040" w:hanging="360"/>
+      </w:pPr>
+      <w:rPr>
+        <w:rFonts w:ascii="Symbol" w:hAnsi="Symbol" w:cs="Symbol" w:hint="default"/>
+      </w:rPr>
+    </w:lvl>
+    <w:lvl w:ilvl="7">
+      <w:numFmt w:val="bullet"/>
+      <w:lvlText w:val="o"/>
+      <w:lvlJc w:val="left"/>
+      <w:pPr>
+        <w:ind w:left="5760" w:hanging="360"/>
+      </w:pPr>
+      <w:rPr>
+        <w:rFonts w:ascii="Courier New" w:hAnsi="Courier New" w:cs="Courier New" w:hint="default"/>
+      </w:rPr>
+    </w:lvl>
+    <w:lvl w:ilvl="8">
+      <w:numFmt w:val="bullet"/>
+      <w:lvlText w:val=""/>
+      <w:lvlJc w:val="left"/>
+      <w:pPr>
+        <w:ind w:left="6480" w:hanging="360"/>
+      </w:pPr>
+      <w:rPr>
+        <w:rFonts w:ascii="Wingdings" w:hAnsi="Wingdings" w:cs="Wingdings" w:hint="default"/>
+      </w:rPr>
+    </w:lvl>
+  </w:abstractNum>
+  <w:abstractNum w:abstractNumId="99411">
+    <w:nsid w:val="00A99411"/>
+    <w:multiLevelType w:val="multilevel"/>
+    <w:lvl w:ilvl="0">
+      <w:start w:val="1"/>
+      <w:numFmt w:val="decimal"/>
+      <w:lvlText w:val="%1."/>
+      <w:lvlJc w:val="left"/>
+      <w:pPr>
+        <w:ind w:left="720" w:hanging="360"/>
+      </w:pPr>
+    </w:lvl>
+    <w:lvl w:ilvl="1">
+      <w:start w:val="1"/>
+      <w:numFmt w:val="decimal"/>
+      <w:lvlText w:val="%2."/>
+      <w:lvlJc w:val="left"/>
+      <w:pPr>
+        <w:ind w:left="1440" w:hanging="360"/>
+      </w:pPr>
+    </w:lvl>
+    <w:lvl w:ilvl="2">
+      <w:start w:val="1"/>
+      <w:numFmt w:val="decimal"/>
+      <w:lvlText w:val="%3."/>
+      <w:lvlJc w:val="left"/>
+      <w:pPr>
+        <w:ind w:left="2160" w:hanging="360"/>
+      </w:pPr>
+    </w:lvl>
+    <w:lvl w:ilvl="3">
+      <w:start w:val="1"/>
+      <w:numFmt w:val="decimal"/>
+      <w:lvlText w:val="%4."/>
+      <w:lvlJc w:val="left"/>
+      <w:pPr>
+        <w:ind w:left="2880" w:hanging="360"/>
+      </w:pPr>
+    </w:lvl>
+    <w:lvl w:ilvl="4">
+      <w:start w:val="1"/>
+      <w:numFmt w:val="decimal"/>
+      <w:lvlText w:val="%5."/>
+      <w:lvlJc w:val="left"/>
+      <w:pPr>
+        <w:ind w:left="3600" w:hanging="360"/>
+      </w:pPr>
+    </w:lvl>
+    <w:lvl w:ilvl="5">
+      <w:start w:val="1"/>
+      <w:numFmt w:val="decimal"/>
+      <w:lvlText w:val="%6."/>
+      <w:lvlJc w:val="left"/>
+      <w:pPr>
+        <w:ind w:left="4320" w:hanging="360"/>
+      </w:pPr>
+    </w:lvl>
+    <w:lvl w:ilvl="6">
+      <w:start w:val="1"/>
+      <w:numFmt w:val="decimal"/>
+      <w:lvlText w:val="%7."/>
+      <w:lvlJc w:val="left"/>
+      <w:pPr>
+        <w:ind w:left="5040" w:hanging="360"/>
+      </w:pPr>
+    </w:lvl>
+    <w:lvl w:ilvl="7">
+      <w:start w:val="1"/>
+      <w:numFmt w:val="decimal"/>
+      <w:lvlText w:val="%8."/>
+      <w:lvlJc w:val="left"/>
+      <w:pPr>
+        <w:ind w:left="5760" w:hanging="360"/>
+      </w:pPr>
+    </w:lvl>
+    <w:lvl w:ilvl="8">
+      <w:start w:val="1"/>
+      <w:numFmt w:val="decimal"/>
+      <w:lvlText w:val="%9."/>
+      <w:lvlJc w:val="left"/>
+      <w:pPr>
+        <w:ind w:left="6480" w:hanging="360"/>
+      </w:pPr>
+    </w:lvl>
+  </w:abstractNum>
   <w:num w:numId="1000">
     <w:abstractNumId w:val="990"/>
+  </w:num>
+  <w:num w:numId="1001">
+    <w:abstractNumId w:val="991"/>
+  </w:num>
+  <w:num w:numId="1002">
+    <w:abstractNumId w:val="991"/>
+  </w:num>
+  <w:num w:numId="1003">
+    <w:abstractNumId w:val="99411"/>
+    <w:lvlOverride w:ilvl="0">
+      <w:startOverride w:val="1"/>
+    </w:lvlOverride>
+    <w:lvlOverride w:ilvl="1">
+      <w:startOverride w:val="1"/>
+    </w:lvlOverride>
+    <w:lvlOverride w:ilvl="2">
+      <w:startOverride w:val="1"/>
+    </w:lvlOverride>
+    <w:lvlOverride w:ilvl="3">
+      <w:startOverride w:val="1"/>
+    </w:lvlOverride>
+    <w:lvlOverride w:ilvl="4">
+      <w:startOverride w:val="1"/>
+    </w:lvlOverride>
+    <w:lvlOverride w:ilvl="5">
+      <w:startOverride w:val="1"/>
+    </w:lvlOverride>
+    <w:lvlOverride w:ilvl="6">
+      <w:startOverride w:val="1"/>
+    </w:lvlOverride>
+    <w:lvlOverride w:ilvl="7">
+      <w:startOverride w:val="1"/>
+    </w:lvlOverride>
+    <w:lvlOverride w:ilvl="8">
+      <w:startOverride w:val="1"/>
+    </w:lvlOverride>
   </w:num>
 </w:numbering>
 </file>

</xml_diff>